<commit_message>
Add Vercel Blob and Domain
</commit_message>
<xml_diff>
--- a/Docs/pass.docx
+++ b/Docs/pass.docx
@@ -3,11 +3,970 @@
 <w:document xmlns:wpc="http://schemas.microsoft.com/office/word/2010/wordprocessingCanvas" xmlns:mc="http://schemas.openxmlformats.org/markup-compatibility/2006" xmlns:o="urn:schemas-microsoft-com:office:office" xmlns:r="http://schemas.openxmlformats.org/officeDocument/2006/relationships" xmlns:m="http://schemas.openxmlformats.org/officeDocument/2006/math" xmlns:v="urn:schemas-microsoft-com:vml" xmlns:wp14="http://schemas.microsoft.com/office/word/2010/wordprocessingDrawing" xmlns:wp="http://schemas.openxmlformats.org/drawingml/2006/wordprocessingDrawing" xmlns:w10="urn:schemas-microsoft-com:office:word" xmlns:w="http://schemas.openxmlformats.org/wordprocessingml/2006/main" xmlns:w14="http://schemas.microsoft.com/office/word/2010/wordml" xmlns:wpg="http://schemas.microsoft.com/office/word/2010/wordprocessingGroup" xmlns:wpi="http://schemas.microsoft.com/office/word/2010/wordprocessingInk" xmlns:wne="http://schemas.microsoft.com/office/word/2006/wordml" xmlns:wps="http://schemas.microsoft.com/office/word/2010/wordprocessingShape" mc:Ignorable="w14 wp14">
   <w:body>
     <w:p>
+      <w:pPr>
+        <w:pBdr>
+          <w:top w:val="single" w:sz="2" w:space="0" w:color="C0C1C6"/>
+          <w:left w:val="single" w:sz="2" w:space="0" w:color="C0C1C6"/>
+          <w:bottom w:val="single" w:sz="2" w:space="0" w:color="C0C1C6"/>
+          <w:right w:val="single" w:sz="2" w:space="0" w:color="C0C1C6"/>
+        </w:pBdr>
+        <w:spacing w:before="100" w:beforeAutospacing="1" w:after="100" w:afterAutospacing="1" w:line="240" w:lineRule="auto"/>
+        <w:rPr>
+          <w:rFonts w:ascii="Segoe UI" w:eastAsia="Times New Roman" w:hAnsi="Segoe UI" w:cs="Segoe UI"/>
+          <w:sz w:val="24"/>
+          <w:szCs w:val="24"/>
+          <w:lang w:eastAsia="de-DE"/>
+        </w:rPr>
+      </w:pPr>
+      <w:r>
+        <w:rPr>
+          <w:rFonts w:ascii="Segoe UI" w:eastAsia="Times New Roman" w:hAnsi="Segoe UI" w:cs="Segoe UI"/>
+          <w:sz w:val="24"/>
+          <w:szCs w:val="24"/>
+          <w:lang w:eastAsia="de-DE"/>
+        </w:rPr>
+        <w:t>Kurz gesagt: </w:t>
+      </w:r>
+      <w:r>
+        <w:rPr>
+          <w:rFonts w:ascii="Segoe UI" w:eastAsia="Times New Roman" w:hAnsi="Segoe UI" w:cs="Segoe UI"/>
+          <w:b/>
+          <w:bCs/>
+          <w:sz w:val="24"/>
+          <w:szCs w:val="24"/>
+          <w:bdr w:val="single" w:sz="2" w:space="0" w:color="C0C1C6" w:frame="1"/>
+          <w:lang w:eastAsia="de-DE"/>
+        </w:rPr>
+        <w:t>Nein, diese Pakete reichen für deine App leider nicht aus.</w:t>
+      </w:r>
+    </w:p>
+    <w:p>
+      <w:pPr>
+        <w:pBdr>
+          <w:top w:val="single" w:sz="2" w:space="0" w:color="C0C1C6"/>
+          <w:left w:val="single" w:sz="2" w:space="0" w:color="C0C1C6"/>
+          <w:bottom w:val="single" w:sz="2" w:space="0" w:color="C0C1C6"/>
+          <w:right w:val="single" w:sz="2" w:space="0" w:color="C0C1C6"/>
+        </w:pBdr>
+        <w:spacing w:before="100" w:beforeAutospacing="1" w:after="100" w:afterAutospacing="1" w:line="240" w:lineRule="auto"/>
+        <w:rPr>
+          <w:rFonts w:ascii="Segoe UI" w:eastAsia="Times New Roman" w:hAnsi="Segoe UI" w:cs="Segoe UI"/>
+          <w:sz w:val="24"/>
+          <w:szCs w:val="24"/>
+          <w:lang w:eastAsia="de-DE"/>
+        </w:rPr>
+      </w:pPr>
+      <w:r>
+        <w:rPr>
+          <w:rFonts w:ascii="Segoe UI" w:eastAsia="Times New Roman" w:hAnsi="Segoe UI" w:cs="Segoe UI"/>
+          <w:sz w:val="24"/>
+          <w:szCs w:val="24"/>
+          <w:lang w:eastAsia="de-DE"/>
+        </w:rPr>
+        <w:t>Deine Anwendung (</w:t>
+      </w:r>
+    </w:p>
+    <w:p>
+      <w:pPr>
+        <w:pBdr>
+          <w:top w:val="single" w:sz="2" w:space="0" w:color="C0C1C6"/>
+          <w:left w:val="single" w:sz="2" w:space="0" w:color="C0C1C6"/>
+          <w:bottom w:val="single" w:sz="2" w:space="0" w:color="C0C1C6"/>
+          <w:right w:val="single" w:sz="2" w:space="0" w:color="C0C1C6"/>
+        </w:pBdr>
+        <w:tabs>
+          <w:tab w:val="left" w:pos="916"/>
+          <w:tab w:val="left" w:pos="1832"/>
+          <w:tab w:val="left" w:pos="2748"/>
+          <w:tab w:val="left" w:pos="3664"/>
+          <w:tab w:val="left" w:pos="4580"/>
+          <w:tab w:val="left" w:pos="5496"/>
+          <w:tab w:val="left" w:pos="6412"/>
+          <w:tab w:val="left" w:pos="7328"/>
+          <w:tab w:val="left" w:pos="8244"/>
+          <w:tab w:val="left" w:pos="9160"/>
+          <w:tab w:val="left" w:pos="10076"/>
+          <w:tab w:val="left" w:pos="10992"/>
+          <w:tab w:val="left" w:pos="11908"/>
+          <w:tab w:val="left" w:pos="12824"/>
+          <w:tab w:val="left" w:pos="13740"/>
+          <w:tab w:val="left" w:pos="14656"/>
+        </w:tabs>
+        <w:spacing w:after="0" w:line="240" w:lineRule="auto"/>
+        <w:rPr>
+          <w:rFonts w:ascii="Courier" w:eastAsia="Times New Roman" w:hAnsi="Courier" w:cs="Courier New"/>
+          <w:sz w:val="21"/>
+          <w:szCs w:val="21"/>
+          <w:lang w:eastAsia="de-DE"/>
+        </w:rPr>
+      </w:pPr>
+      <w:r>
+        <w:rPr>
+          <w:rFonts w:ascii="Courier" w:eastAsia="Times New Roman" w:hAnsi="Courier" w:cs="Courier New"/>
+          <w:sz w:val="20"/>
+          <w:szCs w:val="20"/>
+          <w:bdr w:val="single" w:sz="2" w:space="0" w:color="C0C1C6" w:frame="1"/>
+          <w:lang w:eastAsia="de-DE"/>
+        </w:rPr>
+        <w:t>auto-shop</w:t>
+      </w:r>
+    </w:p>
+    <w:p>
+      <w:pPr>
+        <w:spacing w:after="0" w:line="240" w:lineRule="auto"/>
+        <w:rPr>
+          <w:rFonts w:ascii="Times New Roman" w:eastAsia="Times New Roman" w:hAnsi="Times New Roman" w:cs="Times New Roman"/>
+          <w:sz w:val="24"/>
+          <w:szCs w:val="24"/>
+          <w:lang w:eastAsia="de-DE"/>
+        </w:rPr>
+      </w:pPr>
+      <w:r>
+        <w:rPr>
+          <w:rFonts w:ascii="Times New Roman" w:eastAsia="Times New Roman" w:hAnsi="Times New Roman" w:cs="Times New Roman"/>
+          <w:sz w:val="24"/>
+          <w:szCs w:val="24"/>
+          <w:lang w:eastAsia="de-DE"/>
+        </w:rPr>
+        <w:t>) ist eine moderne </w:t>
+      </w:r>
+      <w:r>
+        <w:rPr>
+          <w:rFonts w:ascii="Times New Roman" w:eastAsia="Times New Roman" w:hAnsi="Times New Roman" w:cs="Times New Roman"/>
+          <w:b/>
+          <w:bCs/>
+          <w:sz w:val="24"/>
+          <w:szCs w:val="24"/>
+          <w:bdr w:val="single" w:sz="2" w:space="0" w:color="C0C1C6" w:frame="1"/>
+          <w:lang w:eastAsia="de-DE"/>
+        </w:rPr>
+        <w:t>Next.js</w:t>
+      </w:r>
+      <w:r>
+        <w:rPr>
+          <w:rFonts w:ascii="Times New Roman" w:eastAsia="Times New Roman" w:hAnsi="Times New Roman" w:cs="Times New Roman"/>
+          <w:sz w:val="24"/>
+          <w:szCs w:val="24"/>
+          <w:lang w:eastAsia="de-DE"/>
+        </w:rPr>
+        <w:t>-App mit einer </w:t>
+      </w:r>
+      <w:r>
+        <w:rPr>
+          <w:rFonts w:ascii="Times New Roman" w:eastAsia="Times New Roman" w:hAnsi="Times New Roman" w:cs="Times New Roman"/>
+          <w:b/>
+          <w:bCs/>
+          <w:sz w:val="24"/>
+          <w:szCs w:val="24"/>
+          <w:bdr w:val="single" w:sz="2" w:space="0" w:color="C0C1C6" w:frame="1"/>
+          <w:lang w:eastAsia="de-DE"/>
+        </w:rPr>
+        <w:t>Prisma-Datenbank</w:t>
+      </w:r>
+      <w:r>
+        <w:rPr>
+          <w:rFonts w:ascii="Times New Roman" w:eastAsia="Times New Roman" w:hAnsi="Times New Roman" w:cs="Times New Roman"/>
+          <w:sz w:val="24"/>
+          <w:szCs w:val="24"/>
+          <w:lang w:eastAsia="de-DE"/>
+        </w:rPr>
+        <w:t>. Das ist kein einfacher Satz von HTML-Dateien, sondern ein echtes Programm, das im Hintergrund ständig laufen muss (ein so genannter Node.js-Prozess).</w:t>
+      </w:r>
+    </w:p>
+    <w:p>
+      <w:pPr>
+        <w:pBdr>
+          <w:top w:val="single" w:sz="2" w:space="0" w:color="C0C1C6"/>
+          <w:left w:val="single" w:sz="2" w:space="0" w:color="C0C1C6"/>
+          <w:bottom w:val="single" w:sz="2" w:space="0" w:color="C0C1C6"/>
+          <w:right w:val="single" w:sz="2" w:space="0" w:color="C0C1C6"/>
+        </w:pBdr>
+        <w:spacing w:before="100" w:beforeAutospacing="1" w:after="100" w:afterAutospacing="1" w:line="240" w:lineRule="auto"/>
+        <w:outlineLvl w:val="2"/>
+        <w:rPr>
+          <w:rFonts w:ascii="Segoe UI" w:eastAsia="Times New Roman" w:hAnsi="Segoe UI" w:cs="Segoe UI"/>
+          <w:b/>
+          <w:bCs/>
+          <w:sz w:val="27"/>
+          <w:szCs w:val="27"/>
+          <w:lang w:eastAsia="de-DE"/>
+        </w:rPr>
+      </w:pPr>
+      <w:r>
+        <w:rPr>
+          <w:rFonts w:ascii="Segoe UI" w:eastAsia="Times New Roman" w:hAnsi="Segoe UI" w:cs="Segoe UI"/>
+          <w:b/>
+          <w:bCs/>
+          <w:sz w:val="27"/>
+          <w:szCs w:val="27"/>
+          <w:lang w:eastAsia="de-DE"/>
+        </w:rPr>
+        <w:t>Warum FTP-Upload hier nicht funktioniert:</w:t>
+      </w:r>
+    </w:p>
+    <w:p>
+      <w:pPr>
+        <w:numPr>
+          <w:ilvl w:val="0"/>
+          <w:numId w:val="1"/>
+        </w:numPr>
+        <w:pBdr>
+          <w:top w:val="single" w:sz="2" w:space="0" w:color="C0C1C6"/>
+          <w:left w:val="single" w:sz="2" w:space="5" w:color="C0C1C6"/>
+          <w:bottom w:val="single" w:sz="2" w:space="0" w:color="C0C1C6"/>
+          <w:right w:val="single" w:sz="2" w:space="0" w:color="C0C1C6"/>
+        </w:pBdr>
+        <w:spacing w:after="0" w:line="240" w:lineRule="auto"/>
+        <w:ind w:left="0"/>
+        <w:rPr>
+          <w:rFonts w:ascii="Segoe UI" w:eastAsia="Times New Roman" w:hAnsi="Segoe UI" w:cs="Segoe UI"/>
+          <w:sz w:val="21"/>
+          <w:szCs w:val="21"/>
+          <w:lang w:eastAsia="de-DE"/>
+        </w:rPr>
+      </w:pPr>
+      <w:r>
+        <w:rPr>
+          <w:rFonts w:ascii="Segoe UI" w:eastAsia="Times New Roman" w:hAnsi="Segoe UI" w:cs="Segoe UI"/>
+          <w:b/>
+          <w:bCs/>
+          <w:sz w:val="21"/>
+          <w:szCs w:val="21"/>
+          <w:bdr w:val="single" w:sz="2" w:space="0" w:color="C0C1C6" w:frame="1"/>
+          <w:lang w:eastAsia="de-DE"/>
+        </w:rPr>
+        <w:t>Fehlende Laufzeit:</w:t>
+      </w:r>
+      <w:r>
+        <w:rPr>
+          <w:rFonts w:ascii="Segoe UI" w:eastAsia="Times New Roman" w:hAnsi="Segoe UI" w:cs="Segoe UI"/>
+          <w:sz w:val="21"/>
+          <w:szCs w:val="21"/>
+          <w:lang w:eastAsia="de-DE"/>
+        </w:rPr>
+        <w:t xml:space="preserve"> Die "Homepage"-Pakete von </w:t>
+      </w:r>
+      <w:proofErr w:type="spellStart"/>
+      <w:r>
+        <w:rPr>
+          <w:rFonts w:ascii="Segoe UI" w:eastAsia="Times New Roman" w:hAnsi="Segoe UI" w:cs="Segoe UI"/>
+          <w:sz w:val="21"/>
+          <w:szCs w:val="21"/>
+          <w:lang w:eastAsia="de-DE"/>
+        </w:rPr>
+        <w:t>Strato</w:t>
+      </w:r>
+      <w:proofErr w:type="spellEnd"/>
+      <w:r>
+        <w:rPr>
+          <w:rFonts w:ascii="Segoe UI" w:eastAsia="Times New Roman" w:hAnsi="Segoe UI" w:cs="Segoe UI"/>
+          <w:sz w:val="21"/>
+          <w:szCs w:val="21"/>
+          <w:lang w:eastAsia="de-DE"/>
+        </w:rPr>
+        <w:t xml:space="preserve"> (auf deinen Bildern) sind für PHP (z.B. </w:t>
+      </w:r>
+      <w:proofErr w:type="spellStart"/>
+      <w:r>
+        <w:rPr>
+          <w:rFonts w:ascii="Segoe UI" w:eastAsia="Times New Roman" w:hAnsi="Segoe UI" w:cs="Segoe UI"/>
+          <w:sz w:val="21"/>
+          <w:szCs w:val="21"/>
+          <w:lang w:eastAsia="de-DE"/>
+        </w:rPr>
+        <w:t>WordPress</w:t>
+      </w:r>
+      <w:proofErr w:type="spellEnd"/>
+      <w:r>
+        <w:rPr>
+          <w:rFonts w:ascii="Segoe UI" w:eastAsia="Times New Roman" w:hAnsi="Segoe UI" w:cs="Segoe UI"/>
+          <w:sz w:val="21"/>
+          <w:szCs w:val="21"/>
+          <w:lang w:eastAsia="de-DE"/>
+        </w:rPr>
+        <w:t>) optimiert. Sie erlauben es nicht, eigene Programme wie den Next.js-Server oder Prisma dauerhaft zu starten.</w:t>
+      </w:r>
+    </w:p>
+    <w:p>
+      <w:pPr>
+        <w:numPr>
+          <w:ilvl w:val="0"/>
+          <w:numId w:val="1"/>
+        </w:numPr>
+        <w:pBdr>
+          <w:top w:val="single" w:sz="2" w:space="0" w:color="C0C1C6"/>
+          <w:left w:val="single" w:sz="2" w:space="5" w:color="C0C1C6"/>
+          <w:bottom w:val="single" w:sz="2" w:space="0" w:color="C0C1C6"/>
+          <w:right w:val="single" w:sz="2" w:space="0" w:color="C0C1C6"/>
+        </w:pBdr>
+        <w:spacing w:after="0" w:line="240" w:lineRule="auto"/>
+        <w:ind w:left="0"/>
+        <w:rPr>
+          <w:rFonts w:ascii="Segoe UI" w:eastAsia="Times New Roman" w:hAnsi="Segoe UI" w:cs="Segoe UI"/>
+          <w:sz w:val="21"/>
+          <w:szCs w:val="21"/>
+          <w:lang w:eastAsia="de-DE"/>
+        </w:rPr>
+      </w:pPr>
+      <w:r>
+        <w:rPr>
+          <w:rFonts w:ascii="Segoe UI" w:eastAsia="Times New Roman" w:hAnsi="Segoe UI" w:cs="Segoe UI"/>
+          <w:b/>
+          <w:bCs/>
+          <w:sz w:val="21"/>
+          <w:szCs w:val="21"/>
+          <w:bdr w:val="single" w:sz="2" w:space="0" w:color="C0C1C6" w:frame="1"/>
+          <w:lang w:eastAsia="de-DE"/>
+        </w:rPr>
+        <w:t>Datenbank:</w:t>
+      </w:r>
+      <w:r>
+        <w:rPr>
+          <w:rFonts w:ascii="Segoe UI" w:eastAsia="Times New Roman" w:hAnsi="Segoe UI" w:cs="Segoe UI"/>
+          <w:sz w:val="21"/>
+          <w:szCs w:val="21"/>
+          <w:lang w:eastAsia="de-DE"/>
+        </w:rPr>
+        <w:t> Deine App nutzt Prisma. Auf einem normalen Webhosting-Paket kannst du die Datenbank-Befehle (</w:t>
+      </w:r>
+    </w:p>
+    <w:p>
+      <w:pPr>
+        <w:pBdr>
+          <w:top w:val="single" w:sz="2" w:space="0" w:color="C0C1C6"/>
+          <w:left w:val="single" w:sz="2" w:space="0" w:color="C0C1C6"/>
+          <w:bottom w:val="single" w:sz="2" w:space="0" w:color="C0C1C6"/>
+          <w:right w:val="single" w:sz="2" w:space="0" w:color="C0C1C6"/>
+        </w:pBdr>
+        <w:tabs>
+          <w:tab w:val="left" w:pos="916"/>
+          <w:tab w:val="left" w:pos="1832"/>
+          <w:tab w:val="left" w:pos="2748"/>
+          <w:tab w:val="left" w:pos="3664"/>
+          <w:tab w:val="left" w:pos="4580"/>
+          <w:tab w:val="left" w:pos="5496"/>
+          <w:tab w:val="left" w:pos="6412"/>
+          <w:tab w:val="left" w:pos="7328"/>
+          <w:tab w:val="left" w:pos="8244"/>
+          <w:tab w:val="left" w:pos="9160"/>
+          <w:tab w:val="left" w:pos="10076"/>
+          <w:tab w:val="left" w:pos="10992"/>
+          <w:tab w:val="left" w:pos="11908"/>
+          <w:tab w:val="left" w:pos="12824"/>
+          <w:tab w:val="left" w:pos="13740"/>
+          <w:tab w:val="left" w:pos="14656"/>
+        </w:tabs>
+        <w:spacing w:after="0" w:line="240" w:lineRule="auto"/>
+        <w:rPr>
+          <w:rFonts w:ascii="Courier" w:eastAsia="Times New Roman" w:hAnsi="Courier" w:cs="Courier New"/>
+          <w:sz w:val="18"/>
+          <w:szCs w:val="18"/>
+          <w:lang w:eastAsia="de-DE"/>
+        </w:rPr>
+      </w:pPr>
+      <w:proofErr w:type="spellStart"/>
+      <w:r>
+        <w:rPr>
+          <w:rFonts w:ascii="Courier" w:eastAsia="Times New Roman" w:hAnsi="Courier" w:cs="Courier New"/>
+          <w:sz w:val="20"/>
+          <w:szCs w:val="20"/>
+          <w:bdr w:val="single" w:sz="2" w:space="0" w:color="C0C1C6" w:frame="1"/>
+          <w:lang w:eastAsia="de-DE"/>
+        </w:rPr>
+        <w:t>prisma</w:t>
+      </w:r>
+      <w:proofErr w:type="spellEnd"/>
+      <w:r>
+        <w:rPr>
+          <w:rFonts w:ascii="Courier" w:eastAsia="Times New Roman" w:hAnsi="Courier" w:cs="Courier New"/>
+          <w:sz w:val="20"/>
+          <w:szCs w:val="20"/>
+          <w:bdr w:val="single" w:sz="2" w:space="0" w:color="C0C1C6" w:frame="1"/>
+          <w:lang w:eastAsia="de-DE"/>
+        </w:rPr>
+        <w:t xml:space="preserve"> </w:t>
+      </w:r>
+      <w:proofErr w:type="spellStart"/>
+      <w:r>
+        <w:rPr>
+          <w:rFonts w:ascii="Courier" w:eastAsia="Times New Roman" w:hAnsi="Courier" w:cs="Courier New"/>
+          <w:sz w:val="20"/>
+          <w:szCs w:val="20"/>
+          <w:bdr w:val="single" w:sz="2" w:space="0" w:color="C0C1C6" w:frame="1"/>
+          <w:lang w:eastAsia="de-DE"/>
+        </w:rPr>
+        <w:t>migrate</w:t>
+      </w:r>
+      <w:proofErr w:type="spellEnd"/>
+    </w:p>
+    <w:p>
+      <w:pPr>
+        <w:pBdr>
+          <w:top w:val="single" w:sz="2" w:space="0" w:color="C0C1C6"/>
+          <w:left w:val="single" w:sz="2" w:space="5" w:color="C0C1C6"/>
+          <w:bottom w:val="single" w:sz="2" w:space="0" w:color="C0C1C6"/>
+          <w:right w:val="single" w:sz="2" w:space="0" w:color="C0C1C6"/>
+        </w:pBdr>
+        <w:spacing w:after="0" w:line="240" w:lineRule="auto"/>
+        <w:rPr>
+          <w:rFonts w:ascii="Segoe UI" w:eastAsia="Times New Roman" w:hAnsi="Segoe UI" w:cs="Segoe UI"/>
+          <w:sz w:val="21"/>
+          <w:szCs w:val="21"/>
+          <w:lang w:eastAsia="de-DE"/>
+        </w:rPr>
+      </w:pPr>
+      <w:r>
+        <w:rPr>
+          <w:rFonts w:ascii="Segoe UI" w:eastAsia="Times New Roman" w:hAnsi="Segoe UI" w:cs="Segoe UI"/>
+          <w:sz w:val="21"/>
+          <w:szCs w:val="21"/>
+          <w:lang w:eastAsia="de-DE"/>
+        </w:rPr>
+        <w:t>) nicht ausführen, da du keinen Zugriff auf die System-Ebene hast.</w:t>
+      </w:r>
+    </w:p>
+    <w:p>
+      <w:pPr>
+        <w:numPr>
+          <w:ilvl w:val="0"/>
+          <w:numId w:val="1"/>
+        </w:numPr>
+        <w:pBdr>
+          <w:top w:val="single" w:sz="2" w:space="0" w:color="C0C1C6"/>
+          <w:left w:val="single" w:sz="2" w:space="5" w:color="C0C1C6"/>
+          <w:bottom w:val="single" w:sz="2" w:space="0" w:color="C0C1C6"/>
+          <w:right w:val="single" w:sz="2" w:space="0" w:color="C0C1C6"/>
+        </w:pBdr>
+        <w:spacing w:after="0" w:line="240" w:lineRule="auto"/>
+        <w:ind w:left="0"/>
+        <w:rPr>
+          <w:rFonts w:ascii="Segoe UI" w:eastAsia="Times New Roman" w:hAnsi="Segoe UI" w:cs="Segoe UI"/>
+          <w:sz w:val="21"/>
+          <w:szCs w:val="21"/>
+          <w:lang w:eastAsia="de-DE"/>
+        </w:rPr>
+      </w:pPr>
+      <w:r>
+        <w:rPr>
+          <w:rFonts w:ascii="Segoe UI" w:eastAsia="Times New Roman" w:hAnsi="Segoe UI" w:cs="Segoe UI"/>
+          <w:b/>
+          <w:bCs/>
+          <w:sz w:val="21"/>
+          <w:szCs w:val="21"/>
+          <w:bdr w:val="single" w:sz="2" w:space="0" w:color="C0C1C6" w:frame="1"/>
+          <w:lang w:eastAsia="de-DE"/>
+        </w:rPr>
+        <w:t>Nur statisch möglich</w:t>
+      </w:r>
+      <w:proofErr w:type="gramStart"/>
+      <w:r>
+        <w:rPr>
+          <w:rFonts w:ascii="Segoe UI" w:eastAsia="Times New Roman" w:hAnsi="Segoe UI" w:cs="Segoe UI"/>
+          <w:b/>
+          <w:bCs/>
+          <w:sz w:val="21"/>
+          <w:szCs w:val="21"/>
+          <w:bdr w:val="single" w:sz="2" w:space="0" w:color="C0C1C6" w:frame="1"/>
+          <w:lang w:eastAsia="de-DE"/>
+        </w:rPr>
+        <w:t>?:</w:t>
+      </w:r>
+      <w:proofErr w:type="gramEnd"/>
+      <w:r>
+        <w:rPr>
+          <w:rFonts w:ascii="Segoe UI" w:eastAsia="Times New Roman" w:hAnsi="Segoe UI" w:cs="Segoe UI"/>
+          <w:sz w:val="21"/>
+          <w:szCs w:val="21"/>
+          <w:lang w:eastAsia="de-DE"/>
+        </w:rPr>
+        <w:t> Du </w:t>
+      </w:r>
+      <w:r>
+        <w:rPr>
+          <w:rFonts w:ascii="Segoe UI" w:eastAsia="Times New Roman" w:hAnsi="Segoe UI" w:cs="Segoe UI"/>
+          <w:i/>
+          <w:iCs/>
+          <w:sz w:val="21"/>
+          <w:szCs w:val="21"/>
+          <w:bdr w:val="single" w:sz="2" w:space="0" w:color="C0C1C6" w:frame="1"/>
+          <w:lang w:eastAsia="de-DE"/>
+        </w:rPr>
+        <w:t>könntest</w:t>
+      </w:r>
+      <w:r>
+        <w:rPr>
+          <w:rFonts w:ascii="Segoe UI" w:eastAsia="Times New Roman" w:hAnsi="Segoe UI" w:cs="Segoe UI"/>
+          <w:sz w:val="21"/>
+          <w:szCs w:val="21"/>
+          <w:lang w:eastAsia="de-DE"/>
+        </w:rPr>
+        <w:t> deine App zwar so umbauen, dass sie rein statisch ist (nur HTML/JS), aber dann würden deine </w:t>
+      </w:r>
+      <w:r>
+        <w:rPr>
+          <w:rFonts w:ascii="Segoe UI" w:eastAsia="Times New Roman" w:hAnsi="Segoe UI" w:cs="Segoe UI"/>
+          <w:b/>
+          <w:bCs/>
+          <w:sz w:val="21"/>
+          <w:szCs w:val="21"/>
+          <w:bdr w:val="single" w:sz="2" w:space="0" w:color="C0C1C6" w:frame="1"/>
+          <w:lang w:eastAsia="de-DE"/>
+        </w:rPr>
+        <w:t>Login-Funktion</w:t>
+      </w:r>
+      <w:r>
+        <w:rPr>
+          <w:rFonts w:ascii="Segoe UI" w:eastAsia="Times New Roman" w:hAnsi="Segoe UI" w:cs="Segoe UI"/>
+          <w:sz w:val="21"/>
+          <w:szCs w:val="21"/>
+          <w:lang w:eastAsia="de-DE"/>
+        </w:rPr>
+        <w:t> und das </w:t>
+      </w:r>
+      <w:r>
+        <w:rPr>
+          <w:rFonts w:ascii="Segoe UI" w:eastAsia="Times New Roman" w:hAnsi="Segoe UI" w:cs="Segoe UI"/>
+          <w:b/>
+          <w:bCs/>
+          <w:sz w:val="21"/>
+          <w:szCs w:val="21"/>
+          <w:bdr w:val="single" w:sz="2" w:space="0" w:color="C0C1C6" w:frame="1"/>
+          <w:lang w:eastAsia="de-DE"/>
+        </w:rPr>
+        <w:t>Kontaktformular</w:t>
+      </w:r>
+      <w:r>
+        <w:rPr>
+          <w:rFonts w:ascii="Segoe UI" w:eastAsia="Times New Roman" w:hAnsi="Segoe UI" w:cs="Segoe UI"/>
+          <w:sz w:val="21"/>
+          <w:szCs w:val="21"/>
+          <w:lang w:eastAsia="de-DE"/>
+        </w:rPr>
+        <w:t> nicht mehr funktionieren, da diese Server-Logik benötigen.</w:t>
+      </w:r>
+    </w:p>
+    <w:p>
+      <w:pPr>
+        <w:pBdr>
+          <w:top w:val="single" w:sz="2" w:space="0" w:color="C0C1C6"/>
+          <w:left w:val="single" w:sz="2" w:space="0" w:color="C0C1C6"/>
+          <w:bottom w:val="single" w:sz="2" w:space="0" w:color="C0C1C6"/>
+          <w:right w:val="single" w:sz="2" w:space="0" w:color="C0C1C6"/>
+        </w:pBdr>
+        <w:spacing w:before="100" w:beforeAutospacing="1" w:after="100" w:afterAutospacing="1" w:line="240" w:lineRule="auto"/>
+        <w:outlineLvl w:val="2"/>
+        <w:rPr>
+          <w:rFonts w:ascii="Segoe UI" w:eastAsia="Times New Roman" w:hAnsi="Segoe UI" w:cs="Segoe UI"/>
+          <w:b/>
+          <w:bCs/>
+          <w:sz w:val="27"/>
+          <w:szCs w:val="27"/>
+          <w:lang w:eastAsia="de-DE"/>
+        </w:rPr>
+      </w:pPr>
+      <w:r>
+        <w:rPr>
+          <w:rFonts w:ascii="Segoe UI" w:eastAsia="Times New Roman" w:hAnsi="Segoe UI" w:cs="Segoe UI"/>
+          <w:b/>
+          <w:bCs/>
+          <w:sz w:val="27"/>
+          <w:szCs w:val="27"/>
+          <w:lang w:eastAsia="de-DE"/>
+        </w:rPr>
+        <w:t>Welches Paket solltest du stattdessen nehmen?</w:t>
+      </w:r>
+    </w:p>
+    <w:p>
+      <w:pPr>
+        <w:pBdr>
+          <w:top w:val="single" w:sz="2" w:space="0" w:color="C0C1C6"/>
+          <w:left w:val="single" w:sz="2" w:space="0" w:color="C0C1C6"/>
+          <w:bottom w:val="single" w:sz="2" w:space="0" w:color="C0C1C6"/>
+          <w:right w:val="single" w:sz="2" w:space="0" w:color="C0C1C6"/>
+        </w:pBdr>
+        <w:spacing w:before="100" w:beforeAutospacing="1" w:after="100" w:afterAutospacing="1" w:line="240" w:lineRule="auto"/>
+        <w:rPr>
+          <w:rFonts w:ascii="Segoe UI" w:eastAsia="Times New Roman" w:hAnsi="Segoe UI" w:cs="Segoe UI"/>
+          <w:sz w:val="24"/>
+          <w:szCs w:val="24"/>
+          <w:lang w:eastAsia="de-DE"/>
+        </w:rPr>
+      </w:pPr>
+      <w:r>
+        <w:rPr>
+          <w:rFonts w:ascii="Segoe UI" w:eastAsia="Times New Roman" w:hAnsi="Segoe UI" w:cs="Segoe UI"/>
+          <w:sz w:val="24"/>
+          <w:szCs w:val="24"/>
+          <w:lang w:eastAsia="de-DE"/>
+        </w:rPr>
+        <w:t xml:space="preserve">Wenn du bei </w:t>
+      </w:r>
+      <w:proofErr w:type="spellStart"/>
+      <w:r>
+        <w:rPr>
+          <w:rFonts w:ascii="Segoe UI" w:eastAsia="Times New Roman" w:hAnsi="Segoe UI" w:cs="Segoe UI"/>
+          <w:sz w:val="24"/>
+          <w:szCs w:val="24"/>
+          <w:lang w:eastAsia="de-DE"/>
+        </w:rPr>
+        <w:t>Strato</w:t>
+      </w:r>
+      <w:proofErr w:type="spellEnd"/>
+      <w:r>
+        <w:rPr>
+          <w:rFonts w:ascii="Segoe UI" w:eastAsia="Times New Roman" w:hAnsi="Segoe UI" w:cs="Segoe UI"/>
+          <w:sz w:val="24"/>
+          <w:szCs w:val="24"/>
+          <w:lang w:eastAsia="de-DE"/>
+        </w:rPr>
+        <w:t xml:space="preserve"> bleiben möchtest, brauchst du einen </w:t>
+      </w:r>
+      <w:r>
+        <w:rPr>
+          <w:rFonts w:ascii="Segoe UI" w:eastAsia="Times New Roman" w:hAnsi="Segoe UI" w:cs="Segoe UI"/>
+          <w:b/>
+          <w:bCs/>
+          <w:sz w:val="24"/>
+          <w:szCs w:val="24"/>
+          <w:bdr w:val="single" w:sz="2" w:space="0" w:color="C0C1C6" w:frame="1"/>
+          <w:lang w:eastAsia="de-DE"/>
+        </w:rPr>
+        <w:t>VPS (Virtual Private Server)</w:t>
+      </w:r>
+      <w:r>
+        <w:rPr>
+          <w:rFonts w:ascii="Segoe UI" w:eastAsia="Times New Roman" w:hAnsi="Segoe UI" w:cs="Segoe UI"/>
+          <w:sz w:val="24"/>
+          <w:szCs w:val="24"/>
+          <w:lang w:eastAsia="de-DE"/>
+        </w:rPr>
+        <w:t>, auch oft </w:t>
+      </w:r>
+      <w:r>
+        <w:rPr>
+          <w:rFonts w:ascii="Segoe UI" w:eastAsia="Times New Roman" w:hAnsi="Segoe UI" w:cs="Segoe UI"/>
+          <w:b/>
+          <w:bCs/>
+          <w:sz w:val="24"/>
+          <w:szCs w:val="24"/>
+          <w:bdr w:val="single" w:sz="2" w:space="0" w:color="C0C1C6" w:frame="1"/>
+          <w:lang w:eastAsia="de-DE"/>
+        </w:rPr>
+        <w:t>"V-Server"</w:t>
+      </w:r>
+      <w:r>
+        <w:rPr>
+          <w:rFonts w:ascii="Segoe UI" w:eastAsia="Times New Roman" w:hAnsi="Segoe UI" w:cs="Segoe UI"/>
+          <w:sz w:val="24"/>
+          <w:szCs w:val="24"/>
+          <w:lang w:eastAsia="de-DE"/>
+        </w:rPr>
+        <w:t> genannt.</w:t>
+      </w:r>
+    </w:p>
+    <w:p>
+      <w:pPr>
+        <w:numPr>
+          <w:ilvl w:val="0"/>
+          <w:numId w:val="2"/>
+        </w:numPr>
+        <w:pBdr>
+          <w:top w:val="single" w:sz="2" w:space="0" w:color="C0C1C6"/>
+          <w:left w:val="single" w:sz="2" w:space="5" w:color="C0C1C6"/>
+          <w:bottom w:val="single" w:sz="2" w:space="0" w:color="C0C1C6"/>
+          <w:right w:val="single" w:sz="2" w:space="0" w:color="C0C1C6"/>
+        </w:pBdr>
+        <w:spacing w:after="0" w:line="240" w:lineRule="auto"/>
+        <w:ind w:left="0"/>
+        <w:rPr>
+          <w:rFonts w:ascii="Segoe UI" w:eastAsia="Times New Roman" w:hAnsi="Segoe UI" w:cs="Segoe UI"/>
+          <w:sz w:val="21"/>
+          <w:szCs w:val="21"/>
+          <w:lang w:eastAsia="de-DE"/>
+        </w:rPr>
+      </w:pPr>
+      <w:r>
+        <w:rPr>
+          <w:rFonts w:ascii="Segoe UI" w:eastAsia="Times New Roman" w:hAnsi="Segoe UI" w:cs="Segoe UI"/>
+          <w:b/>
+          <w:bCs/>
+          <w:sz w:val="21"/>
+          <w:szCs w:val="21"/>
+          <w:bdr w:val="single" w:sz="2" w:space="0" w:color="C0C1C6" w:frame="1"/>
+          <w:lang w:eastAsia="de-DE"/>
+        </w:rPr>
+        <w:t>Vorteil:</w:t>
+      </w:r>
+      <w:r>
+        <w:rPr>
+          <w:rFonts w:ascii="Segoe UI" w:eastAsia="Times New Roman" w:hAnsi="Segoe UI" w:cs="Segoe UI"/>
+          <w:sz w:val="21"/>
+          <w:szCs w:val="21"/>
+          <w:lang w:eastAsia="de-DE"/>
+        </w:rPr>
+        <w:t xml:space="preserve"> Du hast volle Kontrolle, wir können </w:t>
+      </w:r>
+      <w:proofErr w:type="spellStart"/>
+      <w:r>
+        <w:rPr>
+          <w:rFonts w:ascii="Segoe UI" w:eastAsia="Times New Roman" w:hAnsi="Segoe UI" w:cs="Segoe UI"/>
+          <w:sz w:val="21"/>
+          <w:szCs w:val="21"/>
+          <w:lang w:eastAsia="de-DE"/>
+        </w:rPr>
+        <w:t>Nginx</w:t>
+      </w:r>
+      <w:proofErr w:type="spellEnd"/>
+      <w:r>
+        <w:rPr>
+          <w:rFonts w:ascii="Segoe UI" w:eastAsia="Times New Roman" w:hAnsi="Segoe UI" w:cs="Segoe UI"/>
+          <w:sz w:val="21"/>
+          <w:szCs w:val="21"/>
+          <w:lang w:eastAsia="de-DE"/>
+        </w:rPr>
+        <w:t xml:space="preserve"> konfigurieren und die App mit </w:t>
+      </w:r>
+    </w:p>
+    <w:p>
+      <w:pPr>
+        <w:pBdr>
+          <w:top w:val="single" w:sz="2" w:space="0" w:color="C0C1C6"/>
+          <w:left w:val="single" w:sz="2" w:space="0" w:color="C0C1C6"/>
+          <w:bottom w:val="single" w:sz="2" w:space="0" w:color="C0C1C6"/>
+          <w:right w:val="single" w:sz="2" w:space="0" w:color="C0C1C6"/>
+        </w:pBdr>
+        <w:tabs>
+          <w:tab w:val="left" w:pos="916"/>
+          <w:tab w:val="left" w:pos="1832"/>
+          <w:tab w:val="left" w:pos="2748"/>
+          <w:tab w:val="left" w:pos="3664"/>
+          <w:tab w:val="left" w:pos="4580"/>
+          <w:tab w:val="left" w:pos="5496"/>
+          <w:tab w:val="left" w:pos="6412"/>
+          <w:tab w:val="left" w:pos="7328"/>
+          <w:tab w:val="left" w:pos="8244"/>
+          <w:tab w:val="left" w:pos="9160"/>
+          <w:tab w:val="left" w:pos="10076"/>
+          <w:tab w:val="left" w:pos="10992"/>
+          <w:tab w:val="left" w:pos="11908"/>
+          <w:tab w:val="left" w:pos="12824"/>
+          <w:tab w:val="left" w:pos="13740"/>
+          <w:tab w:val="left" w:pos="14656"/>
+        </w:tabs>
+        <w:spacing w:after="0" w:line="240" w:lineRule="auto"/>
+        <w:rPr>
+          <w:rFonts w:ascii="Courier" w:eastAsia="Times New Roman" w:hAnsi="Courier" w:cs="Courier New"/>
+          <w:sz w:val="18"/>
+          <w:szCs w:val="18"/>
+          <w:lang w:eastAsia="de-DE"/>
+        </w:rPr>
+      </w:pPr>
+      <w:r>
+        <w:rPr>
+          <w:rFonts w:ascii="Courier" w:eastAsia="Times New Roman" w:hAnsi="Courier" w:cs="Courier New"/>
+          <w:sz w:val="20"/>
+          <w:szCs w:val="20"/>
+          <w:bdr w:val="single" w:sz="2" w:space="0" w:color="C0C1C6" w:frame="1"/>
+          <w:lang w:eastAsia="de-DE"/>
+        </w:rPr>
+        <w:t>pm2</w:t>
+      </w:r>
+    </w:p>
+    <w:p>
+      <w:pPr>
+        <w:pBdr>
+          <w:top w:val="single" w:sz="2" w:space="0" w:color="C0C1C6"/>
+          <w:left w:val="single" w:sz="2" w:space="5" w:color="C0C1C6"/>
+          <w:bottom w:val="single" w:sz="2" w:space="0" w:color="C0C1C6"/>
+          <w:right w:val="single" w:sz="2" w:space="0" w:color="C0C1C6"/>
+        </w:pBdr>
+        <w:spacing w:after="0" w:line="240" w:lineRule="auto"/>
+        <w:rPr>
+          <w:rFonts w:ascii="Segoe UI" w:eastAsia="Times New Roman" w:hAnsi="Segoe UI" w:cs="Segoe UI"/>
+          <w:sz w:val="21"/>
+          <w:szCs w:val="21"/>
+          <w:lang w:eastAsia="de-DE"/>
+        </w:rPr>
+      </w:pPr>
+      <w:r>
+        <w:rPr>
+          <w:rFonts w:ascii="Segoe UI" w:eastAsia="Times New Roman" w:hAnsi="Segoe UI" w:cs="Segoe UI"/>
+          <w:sz w:val="21"/>
+          <w:szCs w:val="21"/>
+          <w:lang w:eastAsia="de-DE"/>
+        </w:rPr>
+        <w:t> im Hintergrund laufen lassen.</w:t>
+      </w:r>
+    </w:p>
+    <w:p>
+      <w:pPr>
+        <w:numPr>
+          <w:ilvl w:val="0"/>
+          <w:numId w:val="2"/>
+        </w:numPr>
+        <w:pBdr>
+          <w:top w:val="single" w:sz="2" w:space="0" w:color="C0C1C6"/>
+          <w:left w:val="single" w:sz="2" w:space="5" w:color="C0C1C6"/>
+          <w:bottom w:val="single" w:sz="2" w:space="0" w:color="C0C1C6"/>
+          <w:right w:val="single" w:sz="2" w:space="0" w:color="C0C1C6"/>
+        </w:pBdr>
+        <w:spacing w:after="0" w:line="240" w:lineRule="auto"/>
+        <w:ind w:left="0"/>
+        <w:rPr>
+          <w:rFonts w:ascii="Segoe UI" w:eastAsia="Times New Roman" w:hAnsi="Segoe UI" w:cs="Segoe UI"/>
+          <w:sz w:val="21"/>
+          <w:szCs w:val="21"/>
+          <w:lang w:eastAsia="de-DE"/>
+        </w:rPr>
+      </w:pPr>
+      <w:r>
+        <w:rPr>
+          <w:rFonts w:ascii="Segoe UI" w:eastAsia="Times New Roman" w:hAnsi="Segoe UI" w:cs="Segoe UI"/>
+          <w:b/>
+          <w:bCs/>
+          <w:sz w:val="21"/>
+          <w:szCs w:val="21"/>
+          <w:bdr w:val="single" w:sz="2" w:space="0" w:color="C0C1C6" w:frame="1"/>
+          <w:lang w:eastAsia="de-DE"/>
+        </w:rPr>
+        <w:t>Empfehlung:</w:t>
+      </w:r>
+      <w:r>
+        <w:rPr>
+          <w:rFonts w:ascii="Segoe UI" w:eastAsia="Times New Roman" w:hAnsi="Segoe UI" w:cs="Segoe UI"/>
+          <w:sz w:val="21"/>
+          <w:szCs w:val="21"/>
+          <w:lang w:eastAsia="de-DE"/>
+        </w:rPr>
+        <w:t> Ein Paket mit mindestens </w:t>
+      </w:r>
+      <w:r>
+        <w:rPr>
+          <w:rFonts w:ascii="Segoe UI" w:eastAsia="Times New Roman" w:hAnsi="Segoe UI" w:cs="Segoe UI"/>
+          <w:b/>
+          <w:bCs/>
+          <w:sz w:val="21"/>
+          <w:szCs w:val="21"/>
+          <w:bdr w:val="single" w:sz="2" w:space="0" w:color="C0C1C6" w:frame="1"/>
+          <w:lang w:eastAsia="de-DE"/>
+        </w:rPr>
+        <w:t>4 GB RAM</w:t>
+      </w:r>
+      <w:r>
+        <w:rPr>
+          <w:rFonts w:ascii="Segoe UI" w:eastAsia="Times New Roman" w:hAnsi="Segoe UI" w:cs="Segoe UI"/>
+          <w:sz w:val="21"/>
+          <w:szCs w:val="21"/>
+          <w:lang w:eastAsia="de-DE"/>
+        </w:rPr>
+        <w:t> und </w:t>
+      </w:r>
+      <w:r>
+        <w:rPr>
+          <w:rFonts w:ascii="Segoe UI" w:eastAsia="Times New Roman" w:hAnsi="Segoe UI" w:cs="Segoe UI"/>
+          <w:b/>
+          <w:bCs/>
+          <w:sz w:val="21"/>
+          <w:szCs w:val="21"/>
+          <w:bdr w:val="single" w:sz="2" w:space="0" w:color="C0C1C6" w:frame="1"/>
+          <w:lang w:eastAsia="de-DE"/>
+        </w:rPr>
+        <w:t xml:space="preserve">2-4 </w:t>
+      </w:r>
+      <w:proofErr w:type="spellStart"/>
+      <w:r>
+        <w:rPr>
+          <w:rFonts w:ascii="Segoe UI" w:eastAsia="Times New Roman" w:hAnsi="Segoe UI" w:cs="Segoe UI"/>
+          <w:b/>
+          <w:bCs/>
+          <w:sz w:val="21"/>
+          <w:szCs w:val="21"/>
+          <w:bdr w:val="single" w:sz="2" w:space="0" w:color="C0C1C6" w:frame="1"/>
+          <w:lang w:eastAsia="de-DE"/>
+        </w:rPr>
+        <w:t>vCPUs</w:t>
+      </w:r>
+      <w:proofErr w:type="spellEnd"/>
+      <w:r>
+        <w:rPr>
+          <w:rFonts w:ascii="Segoe UI" w:eastAsia="Times New Roman" w:hAnsi="Segoe UI" w:cs="Segoe UI"/>
+          <w:sz w:val="21"/>
+          <w:szCs w:val="21"/>
+          <w:lang w:eastAsia="de-DE"/>
+        </w:rPr>
+        <w:t xml:space="preserve"> (bei </w:t>
+      </w:r>
+      <w:proofErr w:type="spellStart"/>
+      <w:r>
+        <w:rPr>
+          <w:rFonts w:ascii="Segoe UI" w:eastAsia="Times New Roman" w:hAnsi="Segoe UI" w:cs="Segoe UI"/>
+          <w:sz w:val="21"/>
+          <w:szCs w:val="21"/>
+          <w:lang w:eastAsia="de-DE"/>
+        </w:rPr>
+        <w:t>Strato</w:t>
+      </w:r>
+      <w:proofErr w:type="spellEnd"/>
+      <w:r>
+        <w:rPr>
+          <w:rFonts w:ascii="Segoe UI" w:eastAsia="Times New Roman" w:hAnsi="Segoe UI" w:cs="Segoe UI"/>
+          <w:sz w:val="21"/>
+          <w:szCs w:val="21"/>
+          <w:lang w:eastAsia="de-DE"/>
+        </w:rPr>
+        <w:t xml:space="preserve"> oft die VC-Serie, z.B. </w:t>
+      </w:r>
+      <w:r>
+        <w:rPr>
+          <w:rFonts w:ascii="Segoe UI" w:eastAsia="Times New Roman" w:hAnsi="Segoe UI" w:cs="Segoe UI"/>
+          <w:i/>
+          <w:iCs/>
+          <w:sz w:val="21"/>
+          <w:szCs w:val="21"/>
+          <w:bdr w:val="single" w:sz="2" w:space="0" w:color="C0C1C6" w:frame="1"/>
+          <w:lang w:eastAsia="de-DE"/>
+        </w:rPr>
+        <w:t>V-Server Linux VC2</w:t>
+      </w:r>
+      <w:r>
+        <w:rPr>
+          <w:rFonts w:ascii="Segoe UI" w:eastAsia="Times New Roman" w:hAnsi="Segoe UI" w:cs="Segoe UI"/>
+          <w:sz w:val="21"/>
+          <w:szCs w:val="21"/>
+          <w:lang w:eastAsia="de-DE"/>
+        </w:rPr>
+        <w:t> oder höher).</w:t>
+      </w:r>
+    </w:p>
+    <w:p/>
+    <w:p>
+      <w:r>
+        <w:t xml:space="preserve">Webmail: </w:t>
+      </w:r>
+      <w:hyperlink r:id="rId6" w:history="1">
+        <w:r>
+          <w:rPr>
+            <w:rStyle w:val="Hyperlink"/>
+          </w:rPr>
+          <w:t>info@mato-automobile.de</w:t>
+        </w:r>
+      </w:hyperlink>
+      <w:r>
+        <w:t xml:space="preserve"> , pass: </w:t>
+      </w:r>
+      <w:bookmarkStart w:id="0" w:name="_GoBack"/>
+      <w:r>
+        <w:t>AhmedMato2026!</w:t>
+      </w:r>
+      <w:bookmarkEnd w:id="0"/>
+    </w:p>
+    <w:p>
       <w:r>
         <w:rPr>
           <w:noProof/>
           <w:lang w:eastAsia="de-DE"/>
         </w:rPr>
+        <w:lastRenderedPageBreak/>
         <w:drawing>
           <wp:inline distT="0" distB="0" distL="0" distR="0" wp14:anchorId="4FA15D8E" wp14:editId="0FD0B29D">
             <wp:extent cx="5760720" cy="3690634"/>
@@ -24,7 +983,7 @@
                     <pic:cNvPicPr/>
                   </pic:nvPicPr>
                   <pic:blipFill>
-                    <a:blip r:embed="rId5"/>
+                    <a:blip r:embed="rId7"/>
                     <a:stretch>
                       <a:fillRect/>
                     </a:stretch>
@@ -70,7 +1029,7 @@
                     <pic:cNvPicPr/>
                   </pic:nvPicPr>
                   <pic:blipFill>
-                    <a:blip r:embed="rId6"/>
+                    <a:blip r:embed="rId8"/>
                     <a:stretch>
                       <a:fillRect/>
                     </a:stretch>
@@ -96,7 +1055,7 @@
       <w:r>
         <w:br/>
       </w:r>
-      <w:hyperlink r:id="rId7" w:history="1">
+      <w:hyperlink r:id="rId9" w:history="1">
         <w:proofErr w:type="spellStart"/>
         <w:r>
           <w:rPr>
@@ -129,137 +1088,13 @@
         <w:t>MatoAutomobile2026SichererServer01</w:t>
       </w:r>
     </w:p>
-    <w:p/>
-    <w:p/>
-    <w:p/>
-    <w:p/>
-    <w:p>
-      <w:r>
-        <w:rPr>
-          <w:noProof/>
-          <w:lang w:eastAsia="de-DE"/>
-        </w:rPr>
-        <w:lastRenderedPageBreak/>
+    <w:p>
+      <w:r>
         <w:drawing>
-          <wp:inline distT="0" distB="0" distL="0" distR="0" wp14:anchorId="169EA185" wp14:editId="5997352B">
-            <wp:extent cx="5760720" cy="4378417"/>
-            <wp:effectExtent l="0" t="0" r="0" b="3175"/>
-            <wp:docPr id="4" name="Grafik 4"/>
-            <wp:cNvGraphicFramePr>
-              <a:graphicFrameLocks xmlns:a="http://schemas.openxmlformats.org/drawingml/2006/main" noChangeAspect="1"/>
-            </wp:cNvGraphicFramePr>
-            <a:graphic xmlns:a="http://schemas.openxmlformats.org/drawingml/2006/main">
-              <a:graphicData uri="http://schemas.openxmlformats.org/drawingml/2006/picture">
-                <pic:pic xmlns:pic="http://schemas.openxmlformats.org/drawingml/2006/picture">
-                  <pic:nvPicPr>
-                    <pic:cNvPr id="0" name=""/>
-                    <pic:cNvPicPr/>
-                  </pic:nvPicPr>
-                  <pic:blipFill>
-                    <a:blip r:embed="rId8"/>
-                    <a:stretch>
-                      <a:fillRect/>
-                    </a:stretch>
-                  </pic:blipFill>
-                  <pic:spPr>
-                    <a:xfrm>
-                      <a:off x="0" y="0"/>
-                      <a:ext cx="5760720" cy="4378417"/>
-                    </a:xfrm>
-                    <a:prstGeom prst="rect">
-                      <a:avLst/>
-                    </a:prstGeom>
-                  </pic:spPr>
-                </pic:pic>
-              </a:graphicData>
-            </a:graphic>
-          </wp:inline>
-        </w:drawing>
-      </w:r>
-    </w:p>
-    <w:p>
-      <w:proofErr w:type="spellStart"/>
-      <w:r>
-        <w:t>Hetzner</w:t>
-      </w:r>
-      <w:proofErr w:type="spellEnd"/>
-      <w:r>
-        <w:t xml:space="preserve"> Login</w:t>
-      </w:r>
-      <w:r>
-        <w:br/>
-        <w:t>3xe.channel@gmail.com</w:t>
-      </w:r>
-    </w:p>
-    <w:p>
-      <w:r>
-        <w:t>MatoAutomobile2026@@@</w:t>
-      </w:r>
-      <w:r>
-        <w:t>Für Admin Bereich:</w:t>
-      </w:r>
-      <w:r>
-        <w:rPr>
-          <w:noProof/>
-          <w:lang w:eastAsia="de-DE"/>
-        </w:rPr>
-        <w:drawing>
-          <wp:inline distT="0" distB="0" distL="0" distR="0" wp14:anchorId="2AA3276B" wp14:editId="502BF894">
-            <wp:extent cx="5760720" cy="2338953"/>
-            <wp:effectExtent l="0" t="0" r="0" b="4445"/>
-            <wp:docPr id="3" name="Grafik 3"/>
-            <wp:cNvGraphicFramePr>
-              <a:graphicFrameLocks xmlns:a="http://schemas.openxmlformats.org/drawingml/2006/main" noChangeAspect="1"/>
-            </wp:cNvGraphicFramePr>
-            <a:graphic xmlns:a="http://schemas.openxmlformats.org/drawingml/2006/main">
-              <a:graphicData uri="http://schemas.openxmlformats.org/drawingml/2006/picture">
-                <pic:pic xmlns:pic="http://schemas.openxmlformats.org/drawingml/2006/picture">
-                  <pic:nvPicPr>
-                    <pic:cNvPr id="0" name=""/>
-                    <pic:cNvPicPr/>
-                  </pic:nvPicPr>
-                  <pic:blipFill>
-                    <a:blip r:embed="rId9"/>
-                    <a:stretch>
-                      <a:fillRect/>
-                    </a:stretch>
-                  </pic:blipFill>
-                  <pic:spPr>
-                    <a:xfrm>
-                      <a:off x="0" y="0"/>
-                      <a:ext cx="5760720" cy="2338953"/>
-                    </a:xfrm>
-                    <a:prstGeom prst="rect">
-                      <a:avLst/>
-                    </a:prstGeom>
-                  </pic:spPr>
-                </pic:pic>
-              </a:graphicData>
-            </a:graphic>
-          </wp:inline>
-        </w:drawing>
-      </w:r>
-    </w:p>
-    <w:p/>
-    <w:p/>
-    <w:p>
-      <w:r>
-        <w:t xml:space="preserve">Root auf </w:t>
-      </w:r>
-      <w:proofErr w:type="spellStart"/>
-      <w:r>
-        <w:t>Hetzner</w:t>
-      </w:r>
-      <w:proofErr w:type="spellEnd"/>
-    </w:p>
-    <w:p>
-      <w:r>
-        <w:lastRenderedPageBreak/>
-        <w:drawing>
-          <wp:inline distT="0" distB="0" distL="0" distR="0" wp14:anchorId="3EF0B686" wp14:editId="55A740D5">
-            <wp:extent cx="5760720" cy="2278320"/>
-            <wp:effectExtent l="0" t="0" r="0" b="8255"/>
-            <wp:docPr id="11" name="Grafik 11"/>
+          <wp:inline distT="0" distB="0" distL="0" distR="0" wp14:anchorId="48C3C86D" wp14:editId="15C88C85">
+            <wp:extent cx="5760720" cy="1890638"/>
+            <wp:effectExtent l="0" t="0" r="0" b="0"/>
+            <wp:docPr id="6" name="Grafik 6"/>
             <wp:cNvGraphicFramePr>
               <a:graphicFrameLocks xmlns:a="http://schemas.openxmlformats.org/drawingml/2006/main" noChangeAspect="1"/>
             </wp:cNvGraphicFramePr>
@@ -279,7 +1114,7 @@
                   <pic:spPr>
                     <a:xfrm>
                       <a:off x="0" y="0"/>
-                      <a:ext cx="5760720" cy="2278320"/>
+                      <a:ext cx="5760720" cy="1890638"/>
                     </a:xfrm>
                     <a:prstGeom prst="rect">
                       <a:avLst/>
@@ -292,21 +1127,10 @@
         </w:drawing>
       </w:r>
     </w:p>
-    <w:p>
-      <w:r>
-        <w:t>root@46.225.63.21:</w:t>
-      </w:r>
-      <w:r>
-        <w:br/>
-        <w:t xml:space="preserve">Passwort: </w:t>
-      </w:r>
-      <w:proofErr w:type="spellStart"/>
-      <w:r>
-        <w:t>PrhmimERxjMd</w:t>
-      </w:r>
-      <w:proofErr w:type="spellEnd"/>
-    </w:p>
     <w:p/>
+    <w:p/>
+    <w:p/>
+    <w:p/>
     <w:p>
       <w:r>
         <w:rPr>
@@ -314,10 +1138,10 @@
           <w:lang w:eastAsia="de-DE"/>
         </w:rPr>
         <w:drawing>
-          <wp:inline distT="0" distB="0" distL="0" distR="0" wp14:anchorId="246B94AF" wp14:editId="3371E7D8">
-            <wp:extent cx="5760720" cy="3555282"/>
-            <wp:effectExtent l="0" t="0" r="0" b="7620"/>
-            <wp:docPr id="7" name="Grafik 7"/>
+          <wp:inline distT="0" distB="0" distL="0" distR="0" wp14:anchorId="169EA185" wp14:editId="5997352B">
+            <wp:extent cx="5760720" cy="4378417"/>
+            <wp:effectExtent l="0" t="0" r="0" b="3175"/>
+            <wp:docPr id="4" name="Grafik 4"/>
             <wp:cNvGraphicFramePr>
               <a:graphicFrameLocks xmlns:a="http://schemas.openxmlformats.org/drawingml/2006/main" noChangeAspect="1"/>
             </wp:cNvGraphicFramePr>
@@ -337,7 +1161,7 @@
                   <pic:spPr>
                     <a:xfrm>
                       <a:off x="0" y="0"/>
-                      <a:ext cx="5760720" cy="3555282"/>
+                      <a:ext cx="5760720" cy="4378417"/>
                     </a:xfrm>
                     <a:prstGeom prst="rect">
                       <a:avLst/>
@@ -351,12 +1175,25 @@
       </w:r>
     </w:p>
     <w:p>
-      <w:r>
-        <w:lastRenderedPageBreak/>
-        <w:t>Zusammenfassung:</w:t>
+      <w:proofErr w:type="spellStart"/>
+      <w:r>
+        <w:t>Hetzner</w:t>
+      </w:r>
+      <w:proofErr w:type="spellEnd"/>
+      <w:r>
+        <w:t xml:space="preserve"> Login</w:t>
       </w:r>
       <w:r>
         <w:br/>
+        <w:t>3xe.channel@gmail.com</w:t>
+      </w:r>
+    </w:p>
+    <w:p>
+      <w:r>
+        <w:t>MatoAutomobile2026@@@</w:t>
+      </w:r>
+      <w:r>
+        <w:t>Für Admin Bereich:</w:t>
       </w:r>
       <w:r>
         <w:rPr>
@@ -364,10 +1201,10 @@
           <w:lang w:eastAsia="de-DE"/>
         </w:rPr>
         <w:drawing>
-          <wp:inline distT="0" distB="0" distL="0" distR="0" wp14:anchorId="5DF69376" wp14:editId="60F7D87A">
-            <wp:extent cx="5760720" cy="2615781"/>
-            <wp:effectExtent l="0" t="0" r="0" b="0"/>
-            <wp:docPr id="5" name="Grafik 5"/>
+          <wp:inline distT="0" distB="0" distL="0" distR="0" wp14:anchorId="2AA3276B" wp14:editId="502BF894">
+            <wp:extent cx="5760720" cy="2338953"/>
+            <wp:effectExtent l="0" t="0" r="0" b="4445"/>
+            <wp:docPr id="3" name="Grafik 3"/>
             <wp:cNvGraphicFramePr>
               <a:graphicFrameLocks xmlns:a="http://schemas.openxmlformats.org/drawingml/2006/main" noChangeAspect="1"/>
             </wp:cNvGraphicFramePr>
@@ -387,7 +1224,7 @@
                   <pic:spPr>
                     <a:xfrm>
                       <a:off x="0" y="0"/>
-                      <a:ext cx="5760720" cy="2615781"/>
+                      <a:ext cx="5760720" cy="2338953"/>
                     </a:xfrm>
                     <a:prstGeom prst="rect">
                       <a:avLst/>
@@ -401,22 +1238,28 @@
       </w:r>
     </w:p>
     <w:p/>
-    <w:p>
-      <w:r>
-        <w:t xml:space="preserve">S3 Zugangsdaten: </w:t>
-      </w:r>
-      <w:r>
-        <w:t>VuVaeXnKFej6Tc28BwtfvMLYuRLYAHSbYXcqzyUk</w:t>
-      </w:r>
-    </w:p>
     <w:p/>
     <w:p>
       <w:r>
+        <w:t xml:space="preserve">Root auf </w:t>
+      </w:r>
+      <w:proofErr w:type="spellStart"/>
+      <w:r>
+        <w:t>Hetzner</w:t>
+      </w:r>
+      <w:proofErr w:type="spellEnd"/>
+    </w:p>
+    <w:p>
+      <w:r>
+        <w:rPr>
+          <w:noProof/>
+          <w:lang w:eastAsia="de-DE"/>
+        </w:rPr>
         <w:drawing>
-          <wp:inline distT="0" distB="0" distL="0" distR="0" wp14:anchorId="34FE5A69" wp14:editId="5AE5F3DB">
-            <wp:extent cx="5760720" cy="1219391"/>
-            <wp:effectExtent l="0" t="0" r="0" b="0"/>
-            <wp:docPr id="9" name="Grafik 9"/>
+          <wp:inline distT="0" distB="0" distL="0" distR="0" wp14:anchorId="3EF0B686" wp14:editId="55A740D5">
+            <wp:extent cx="5760720" cy="2278320"/>
+            <wp:effectExtent l="0" t="0" r="0" b="8255"/>
+            <wp:docPr id="11" name="Grafik 11"/>
             <wp:cNvGraphicFramePr>
               <a:graphicFrameLocks xmlns:a="http://schemas.openxmlformats.org/drawingml/2006/main" noChangeAspect="1"/>
             </wp:cNvGraphicFramePr>
@@ -436,7 +1279,7 @@
                   <pic:spPr>
                     <a:xfrm>
                       <a:off x="0" y="0"/>
-                      <a:ext cx="5760720" cy="1219391"/>
+                      <a:ext cx="5760720" cy="2278320"/>
                     </a:xfrm>
                     <a:prstGeom prst="rect">
                       <a:avLst/>
@@ -449,22 +1292,32 @@
         </w:drawing>
       </w:r>
     </w:p>
+    <w:p>
+      <w:r>
+        <w:t>root@46.225.63.21:</w:t>
+      </w:r>
+      <w:r>
+        <w:br/>
+        <w:t xml:space="preserve">Passwort: </w:t>
+      </w:r>
+      <w:proofErr w:type="spellStart"/>
+      <w:r>
+        <w:t>PrhmimERxjMd</w:t>
+      </w:r>
+      <w:proofErr w:type="spellEnd"/>
+    </w:p>
     <w:p/>
     <w:p>
       <w:r>
-        <w:t xml:space="preserve">API-TOKEN: </w:t>
-      </w:r>
-      <w:r>
-        <w:t>RkVBabj7nlullfJn6S6o9kzBpMBz6vVm7ghnCCqyNAI06mWvtRsGPPLx8su3sft5</w:t>
-      </w:r>
-    </w:p>
-    <w:p>
-      <w:r>
+        <w:rPr>
+          <w:noProof/>
+          <w:lang w:eastAsia="de-DE"/>
+        </w:rPr>
         <w:drawing>
-          <wp:inline distT="0" distB="0" distL="0" distR="0" wp14:anchorId="317D653B" wp14:editId="73F08CD9">
-            <wp:extent cx="5760720" cy="2861285"/>
-            <wp:effectExtent l="0" t="0" r="0" b="0"/>
-            <wp:docPr id="10" name="Grafik 10"/>
+          <wp:inline distT="0" distB="0" distL="0" distR="0" wp14:anchorId="246B94AF" wp14:editId="3371E7D8">
+            <wp:extent cx="5760720" cy="3555282"/>
+            <wp:effectExtent l="0" t="0" r="0" b="7620"/>
+            <wp:docPr id="7" name="Grafik 7"/>
             <wp:cNvGraphicFramePr>
               <a:graphicFrameLocks xmlns:a="http://schemas.openxmlformats.org/drawingml/2006/main" noChangeAspect="1"/>
             </wp:cNvGraphicFramePr>
@@ -484,7 +1337,7 @@
                   <pic:spPr>
                     <a:xfrm>
                       <a:off x="0" y="0"/>
-                      <a:ext cx="5760720" cy="2861285"/>
+                      <a:ext cx="5760720" cy="3555282"/>
                     </a:xfrm>
                     <a:prstGeom prst="rect">
                       <a:avLst/>
@@ -497,14 +1350,24 @@
         </w:drawing>
       </w:r>
     </w:p>
-    <w:p/>
-    <w:p>
-      <w:r>
+    <w:p>
+      <w:r>
+        <w:lastRenderedPageBreak/>
+        <w:t>Zusammenfassung:</w:t>
+      </w:r>
+      <w:r>
+        <w:br/>
+      </w:r>
+      <w:r>
+        <w:rPr>
+          <w:noProof/>
+          <w:lang w:eastAsia="de-DE"/>
+        </w:rPr>
         <w:drawing>
-          <wp:inline distT="0" distB="0" distL="0" distR="0" wp14:anchorId="287ACB6F" wp14:editId="0BD688BC">
-            <wp:extent cx="5760720" cy="1392103"/>
+          <wp:inline distT="0" distB="0" distL="0" distR="0" wp14:anchorId="5DF69376" wp14:editId="60F7D87A">
+            <wp:extent cx="5760720" cy="2615781"/>
             <wp:effectExtent l="0" t="0" r="0" b="0"/>
-            <wp:docPr id="12" name="Grafik 12"/>
+            <wp:docPr id="5" name="Grafik 5"/>
             <wp:cNvGraphicFramePr>
               <a:graphicFrameLocks xmlns:a="http://schemas.openxmlformats.org/drawingml/2006/main" noChangeAspect="1"/>
             </wp:cNvGraphicFramePr>
@@ -524,6 +1387,155 @@
                   <pic:spPr>
                     <a:xfrm>
                       <a:off x="0" y="0"/>
+                      <a:ext cx="5760720" cy="2615781"/>
+                    </a:xfrm>
+                    <a:prstGeom prst="rect">
+                      <a:avLst/>
+                    </a:prstGeom>
+                  </pic:spPr>
+                </pic:pic>
+              </a:graphicData>
+            </a:graphic>
+          </wp:inline>
+        </w:drawing>
+      </w:r>
+    </w:p>
+    <w:p/>
+    <w:p>
+      <w:r>
+        <w:t xml:space="preserve">S3 Zugangsdaten: </w:t>
+      </w:r>
+      <w:r>
+        <w:t>VuVaeXnKFej6Tc28BwtfvMLYuRLYAHSbYXcqzyUk</w:t>
+      </w:r>
+    </w:p>
+    <w:p/>
+    <w:p>
+      <w:r>
+        <w:rPr>
+          <w:noProof/>
+          <w:lang w:eastAsia="de-DE"/>
+        </w:rPr>
+        <w:drawing>
+          <wp:inline distT="0" distB="0" distL="0" distR="0" wp14:anchorId="34FE5A69" wp14:editId="5AE5F3DB">
+            <wp:extent cx="5760720" cy="1219391"/>
+            <wp:effectExtent l="0" t="0" r="0" b="0"/>
+            <wp:docPr id="9" name="Grafik 9"/>
+            <wp:cNvGraphicFramePr>
+              <a:graphicFrameLocks xmlns:a="http://schemas.openxmlformats.org/drawingml/2006/main" noChangeAspect="1"/>
+            </wp:cNvGraphicFramePr>
+            <a:graphic xmlns:a="http://schemas.openxmlformats.org/drawingml/2006/main">
+              <a:graphicData uri="http://schemas.openxmlformats.org/drawingml/2006/picture">
+                <pic:pic xmlns:pic="http://schemas.openxmlformats.org/drawingml/2006/picture">
+                  <pic:nvPicPr>
+                    <pic:cNvPr id="0" name=""/>
+                    <pic:cNvPicPr/>
+                  </pic:nvPicPr>
+                  <pic:blipFill>
+                    <a:blip r:embed="rId16"/>
+                    <a:stretch>
+                      <a:fillRect/>
+                    </a:stretch>
+                  </pic:blipFill>
+                  <pic:spPr>
+                    <a:xfrm>
+                      <a:off x="0" y="0"/>
+                      <a:ext cx="5760720" cy="1219391"/>
+                    </a:xfrm>
+                    <a:prstGeom prst="rect">
+                      <a:avLst/>
+                    </a:prstGeom>
+                  </pic:spPr>
+                </pic:pic>
+              </a:graphicData>
+            </a:graphic>
+          </wp:inline>
+        </w:drawing>
+      </w:r>
+    </w:p>
+    <w:p/>
+    <w:p>
+      <w:r>
+        <w:t xml:space="preserve">API-TOKEN: </w:t>
+      </w:r>
+      <w:r>
+        <w:t>RkVBabj7nlullfJn6S6o9kzBpMBz6vVm7ghnCCqyNAI06mWvtRsGPPLx8su3sft5</w:t>
+      </w:r>
+    </w:p>
+    <w:p>
+      <w:r>
+        <w:rPr>
+          <w:noProof/>
+          <w:lang w:eastAsia="de-DE"/>
+        </w:rPr>
+        <w:drawing>
+          <wp:inline distT="0" distB="0" distL="0" distR="0" wp14:anchorId="317D653B" wp14:editId="73F08CD9">
+            <wp:extent cx="5760720" cy="2861285"/>
+            <wp:effectExtent l="0" t="0" r="0" b="0"/>
+            <wp:docPr id="10" name="Grafik 10"/>
+            <wp:cNvGraphicFramePr>
+              <a:graphicFrameLocks xmlns:a="http://schemas.openxmlformats.org/drawingml/2006/main" noChangeAspect="1"/>
+            </wp:cNvGraphicFramePr>
+            <a:graphic xmlns:a="http://schemas.openxmlformats.org/drawingml/2006/main">
+              <a:graphicData uri="http://schemas.openxmlformats.org/drawingml/2006/picture">
+                <pic:pic xmlns:pic="http://schemas.openxmlformats.org/drawingml/2006/picture">
+                  <pic:nvPicPr>
+                    <pic:cNvPr id="0" name=""/>
+                    <pic:cNvPicPr/>
+                  </pic:nvPicPr>
+                  <pic:blipFill>
+                    <a:blip r:embed="rId17"/>
+                    <a:stretch>
+                      <a:fillRect/>
+                    </a:stretch>
+                  </pic:blipFill>
+                  <pic:spPr>
+                    <a:xfrm>
+                      <a:off x="0" y="0"/>
+                      <a:ext cx="5760720" cy="2861285"/>
+                    </a:xfrm>
+                    <a:prstGeom prst="rect">
+                      <a:avLst/>
+                    </a:prstGeom>
+                  </pic:spPr>
+                </pic:pic>
+              </a:graphicData>
+            </a:graphic>
+          </wp:inline>
+        </w:drawing>
+      </w:r>
+    </w:p>
+    <w:p/>
+    <w:p>
+      <w:r>
+        <w:rPr>
+          <w:noProof/>
+          <w:lang w:eastAsia="de-DE"/>
+        </w:rPr>
+        <w:drawing>
+          <wp:inline distT="0" distB="0" distL="0" distR="0" wp14:anchorId="287ACB6F" wp14:editId="0BD688BC">
+            <wp:extent cx="5760720" cy="1392103"/>
+            <wp:effectExtent l="0" t="0" r="0" b="0"/>
+            <wp:docPr id="12" name="Grafik 12"/>
+            <wp:cNvGraphicFramePr>
+              <a:graphicFrameLocks xmlns:a="http://schemas.openxmlformats.org/drawingml/2006/main" noChangeAspect="1"/>
+            </wp:cNvGraphicFramePr>
+            <a:graphic xmlns:a="http://schemas.openxmlformats.org/drawingml/2006/main">
+              <a:graphicData uri="http://schemas.openxmlformats.org/drawingml/2006/picture">
+                <pic:pic xmlns:pic="http://schemas.openxmlformats.org/drawingml/2006/picture">
+                  <pic:nvPicPr>
+                    <pic:cNvPr id="0" name=""/>
+                    <pic:cNvPicPr/>
+                  </pic:nvPicPr>
+                  <pic:blipFill>
+                    <a:blip r:embed="rId18"/>
+                    <a:stretch>
+                      <a:fillRect/>
+                    </a:stretch>
+                  </pic:blipFill>
+                  <pic:spPr>
+                    <a:xfrm>
+                      <a:off x="0" y="0"/>
                       <a:ext cx="5760720" cy="1392103"/>
                     </a:xfrm>
                     <a:prstGeom prst="rect">
@@ -536,8 +1548,6 @@
           </wp:inline>
         </w:drawing>
       </w:r>
-      <w:bookmarkStart w:id="0" w:name="_GoBack"/>
-      <w:bookmarkEnd w:id="0"/>
     </w:p>
     <w:sectPr>
       <w:pgSz w:w="11906" w:h="16838"/>
@@ -547,6 +1557,279 @@
     </w:sectPr>
   </w:body>
 </w:document>
+</file>
+
+<file path=word/numbering.xml><?xml version="1.0" encoding="utf-8"?>
+<w:numbering xmlns:wpc="http://schemas.microsoft.com/office/word/2010/wordprocessingCanvas" xmlns:mc="http://schemas.openxmlformats.org/markup-compatibility/2006" xmlns:o="urn:schemas-microsoft-com:office:office" xmlns:r="http://schemas.openxmlformats.org/officeDocument/2006/relationships" xmlns:m="http://schemas.openxmlformats.org/officeDocument/2006/math" xmlns:v="urn:schemas-microsoft-com:vml" xmlns:wp14="http://schemas.microsoft.com/office/word/2010/wordprocessingDrawing" xmlns:wp="http://schemas.openxmlformats.org/drawingml/2006/wordprocessingDrawing" xmlns:w10="urn:schemas-microsoft-com:office:word" xmlns:w="http://schemas.openxmlformats.org/wordprocessingml/2006/main" xmlns:w14="http://schemas.microsoft.com/office/word/2010/wordml" xmlns:wpg="http://schemas.microsoft.com/office/word/2010/wordprocessingGroup" xmlns:wpi="http://schemas.microsoft.com/office/word/2010/wordprocessingInk" xmlns:wne="http://schemas.microsoft.com/office/word/2006/wordml" xmlns:wps="http://schemas.microsoft.com/office/word/2010/wordprocessingShape" mc:Ignorable="w14 wp14">
+  <w:abstractNum w:abstractNumId="0">
+    <w:nsid w:val="693B5B7F"/>
+    <w:multiLevelType w:val="multilevel"/>
+    <w:tmpl w:val="D1D8DF38"/>
+    <w:lvl w:ilvl="0">
+      <w:start w:val="1"/>
+      <w:numFmt w:val="bullet"/>
+      <w:lvlText w:val=""/>
+      <w:lvlJc w:val="left"/>
+      <w:pPr>
+        <w:tabs>
+          <w:tab w:val="num" w:pos="720"/>
+        </w:tabs>
+        <w:ind w:left="720" w:hanging="360"/>
+      </w:pPr>
+      <w:rPr>
+        <w:rFonts w:ascii="Symbol" w:hAnsi="Symbol" w:hint="default"/>
+        <w:sz w:val="20"/>
+      </w:rPr>
+    </w:lvl>
+    <w:lvl w:ilvl="1" w:tentative="1">
+      <w:start w:val="1"/>
+      <w:numFmt w:val="bullet"/>
+      <w:lvlText w:val=""/>
+      <w:lvlJc w:val="left"/>
+      <w:pPr>
+        <w:tabs>
+          <w:tab w:val="num" w:pos="1440"/>
+        </w:tabs>
+        <w:ind w:left="1440" w:hanging="360"/>
+      </w:pPr>
+      <w:rPr>
+        <w:rFonts w:ascii="Symbol" w:hAnsi="Symbol" w:hint="default"/>
+        <w:sz w:val="20"/>
+      </w:rPr>
+    </w:lvl>
+    <w:lvl w:ilvl="2" w:tentative="1">
+      <w:start w:val="1"/>
+      <w:numFmt w:val="bullet"/>
+      <w:lvlText w:val=""/>
+      <w:lvlJc w:val="left"/>
+      <w:pPr>
+        <w:tabs>
+          <w:tab w:val="num" w:pos="2160"/>
+        </w:tabs>
+        <w:ind w:left="2160" w:hanging="360"/>
+      </w:pPr>
+      <w:rPr>
+        <w:rFonts w:ascii="Symbol" w:hAnsi="Symbol" w:hint="default"/>
+        <w:sz w:val="20"/>
+      </w:rPr>
+    </w:lvl>
+    <w:lvl w:ilvl="3" w:tentative="1">
+      <w:start w:val="1"/>
+      <w:numFmt w:val="bullet"/>
+      <w:lvlText w:val=""/>
+      <w:lvlJc w:val="left"/>
+      <w:pPr>
+        <w:tabs>
+          <w:tab w:val="num" w:pos="2880"/>
+        </w:tabs>
+        <w:ind w:left="2880" w:hanging="360"/>
+      </w:pPr>
+      <w:rPr>
+        <w:rFonts w:ascii="Symbol" w:hAnsi="Symbol" w:hint="default"/>
+        <w:sz w:val="20"/>
+      </w:rPr>
+    </w:lvl>
+    <w:lvl w:ilvl="4" w:tentative="1">
+      <w:start w:val="1"/>
+      <w:numFmt w:val="bullet"/>
+      <w:lvlText w:val=""/>
+      <w:lvlJc w:val="left"/>
+      <w:pPr>
+        <w:tabs>
+          <w:tab w:val="num" w:pos="3600"/>
+        </w:tabs>
+        <w:ind w:left="3600" w:hanging="360"/>
+      </w:pPr>
+      <w:rPr>
+        <w:rFonts w:ascii="Symbol" w:hAnsi="Symbol" w:hint="default"/>
+        <w:sz w:val="20"/>
+      </w:rPr>
+    </w:lvl>
+    <w:lvl w:ilvl="5" w:tentative="1">
+      <w:start w:val="1"/>
+      <w:numFmt w:val="bullet"/>
+      <w:lvlText w:val=""/>
+      <w:lvlJc w:val="left"/>
+      <w:pPr>
+        <w:tabs>
+          <w:tab w:val="num" w:pos="4320"/>
+        </w:tabs>
+        <w:ind w:left="4320" w:hanging="360"/>
+      </w:pPr>
+      <w:rPr>
+        <w:rFonts w:ascii="Symbol" w:hAnsi="Symbol" w:hint="default"/>
+        <w:sz w:val="20"/>
+      </w:rPr>
+    </w:lvl>
+    <w:lvl w:ilvl="6" w:tentative="1">
+      <w:start w:val="1"/>
+      <w:numFmt w:val="bullet"/>
+      <w:lvlText w:val=""/>
+      <w:lvlJc w:val="left"/>
+      <w:pPr>
+        <w:tabs>
+          <w:tab w:val="num" w:pos="5040"/>
+        </w:tabs>
+        <w:ind w:left="5040" w:hanging="360"/>
+      </w:pPr>
+      <w:rPr>
+        <w:rFonts w:ascii="Symbol" w:hAnsi="Symbol" w:hint="default"/>
+        <w:sz w:val="20"/>
+      </w:rPr>
+    </w:lvl>
+    <w:lvl w:ilvl="7" w:tentative="1">
+      <w:start w:val="1"/>
+      <w:numFmt w:val="bullet"/>
+      <w:lvlText w:val=""/>
+      <w:lvlJc w:val="left"/>
+      <w:pPr>
+        <w:tabs>
+          <w:tab w:val="num" w:pos="5760"/>
+        </w:tabs>
+        <w:ind w:left="5760" w:hanging="360"/>
+      </w:pPr>
+      <w:rPr>
+        <w:rFonts w:ascii="Symbol" w:hAnsi="Symbol" w:hint="default"/>
+        <w:sz w:val="20"/>
+      </w:rPr>
+    </w:lvl>
+    <w:lvl w:ilvl="8" w:tentative="1">
+      <w:start w:val="1"/>
+      <w:numFmt w:val="bullet"/>
+      <w:lvlText w:val=""/>
+      <w:lvlJc w:val="left"/>
+      <w:pPr>
+        <w:tabs>
+          <w:tab w:val="num" w:pos="6480"/>
+        </w:tabs>
+        <w:ind w:left="6480" w:hanging="360"/>
+      </w:pPr>
+      <w:rPr>
+        <w:rFonts w:ascii="Symbol" w:hAnsi="Symbol" w:hint="default"/>
+        <w:sz w:val="20"/>
+      </w:rPr>
+    </w:lvl>
+  </w:abstractNum>
+  <w:abstractNum w:abstractNumId="1">
+    <w:nsid w:val="6BEA349C"/>
+    <w:multiLevelType w:val="multilevel"/>
+    <w:tmpl w:val="23CCA13A"/>
+    <w:lvl w:ilvl="0">
+      <w:start w:val="1"/>
+      <w:numFmt w:val="decimal"/>
+      <w:lvlText w:val="%1."/>
+      <w:lvlJc w:val="left"/>
+      <w:pPr>
+        <w:tabs>
+          <w:tab w:val="num" w:pos="720"/>
+        </w:tabs>
+        <w:ind w:left="720" w:hanging="360"/>
+      </w:pPr>
+    </w:lvl>
+    <w:lvl w:ilvl="1" w:tentative="1">
+      <w:start w:val="1"/>
+      <w:numFmt w:val="decimal"/>
+      <w:lvlText w:val="%2."/>
+      <w:lvlJc w:val="left"/>
+      <w:pPr>
+        <w:tabs>
+          <w:tab w:val="num" w:pos="1440"/>
+        </w:tabs>
+        <w:ind w:left="1440" w:hanging="360"/>
+      </w:pPr>
+    </w:lvl>
+    <w:lvl w:ilvl="2" w:tentative="1">
+      <w:start w:val="1"/>
+      <w:numFmt w:val="decimal"/>
+      <w:lvlText w:val="%3."/>
+      <w:lvlJc w:val="left"/>
+      <w:pPr>
+        <w:tabs>
+          <w:tab w:val="num" w:pos="2160"/>
+        </w:tabs>
+        <w:ind w:left="2160" w:hanging="360"/>
+      </w:pPr>
+    </w:lvl>
+    <w:lvl w:ilvl="3" w:tentative="1">
+      <w:start w:val="1"/>
+      <w:numFmt w:val="decimal"/>
+      <w:lvlText w:val="%4."/>
+      <w:lvlJc w:val="left"/>
+      <w:pPr>
+        <w:tabs>
+          <w:tab w:val="num" w:pos="2880"/>
+        </w:tabs>
+        <w:ind w:left="2880" w:hanging="360"/>
+      </w:pPr>
+    </w:lvl>
+    <w:lvl w:ilvl="4" w:tentative="1">
+      <w:start w:val="1"/>
+      <w:numFmt w:val="decimal"/>
+      <w:lvlText w:val="%5."/>
+      <w:lvlJc w:val="left"/>
+      <w:pPr>
+        <w:tabs>
+          <w:tab w:val="num" w:pos="3600"/>
+        </w:tabs>
+        <w:ind w:left="3600" w:hanging="360"/>
+      </w:pPr>
+    </w:lvl>
+    <w:lvl w:ilvl="5" w:tentative="1">
+      <w:start w:val="1"/>
+      <w:numFmt w:val="decimal"/>
+      <w:lvlText w:val="%6."/>
+      <w:lvlJc w:val="left"/>
+      <w:pPr>
+        <w:tabs>
+          <w:tab w:val="num" w:pos="4320"/>
+        </w:tabs>
+        <w:ind w:left="4320" w:hanging="360"/>
+      </w:pPr>
+    </w:lvl>
+    <w:lvl w:ilvl="6" w:tentative="1">
+      <w:start w:val="1"/>
+      <w:numFmt w:val="decimal"/>
+      <w:lvlText w:val="%7."/>
+      <w:lvlJc w:val="left"/>
+      <w:pPr>
+        <w:tabs>
+          <w:tab w:val="num" w:pos="5040"/>
+        </w:tabs>
+        <w:ind w:left="5040" w:hanging="360"/>
+      </w:pPr>
+    </w:lvl>
+    <w:lvl w:ilvl="7" w:tentative="1">
+      <w:start w:val="1"/>
+      <w:numFmt w:val="decimal"/>
+      <w:lvlText w:val="%8."/>
+      <w:lvlJc w:val="left"/>
+      <w:pPr>
+        <w:tabs>
+          <w:tab w:val="num" w:pos="5760"/>
+        </w:tabs>
+        <w:ind w:left="5760" w:hanging="360"/>
+      </w:pPr>
+    </w:lvl>
+    <w:lvl w:ilvl="8" w:tentative="1">
+      <w:start w:val="1"/>
+      <w:numFmt w:val="decimal"/>
+      <w:lvlText w:val="%9."/>
+      <w:lvlJc w:val="left"/>
+      <w:pPr>
+        <w:tabs>
+          <w:tab w:val="num" w:pos="6480"/>
+        </w:tabs>
+        <w:ind w:left="6480" w:hanging="360"/>
+      </w:pPr>
+    </w:lvl>
+  </w:abstractNum>
+  <w:num w:numId="1">
+    <w:abstractNumId w:val="1"/>
+  </w:num>
+  <w:num w:numId="2">
+    <w:abstractNumId w:val="0"/>
+  </w:num>
+</w:numbering>
 </file>
 
 <file path=word/styles.xml><?xml version="1.0" encoding="utf-8"?>
@@ -709,6 +1992,26 @@
     <w:name w:val="Normal"/>
     <w:qFormat/>
   </w:style>
+  <w:style w:type="paragraph" w:styleId="berschrift3">
+    <w:name w:val="heading 3"/>
+    <w:basedOn w:val="Standard"/>
+    <w:link w:val="berschrift3Zchn"/>
+    <w:uiPriority w:val="9"/>
+    <w:qFormat/>
+    <w:rsid w:val="000361C3"/>
+    <w:pPr>
+      <w:spacing w:before="100" w:beforeAutospacing="1" w:after="100" w:afterAutospacing="1" w:line="240" w:lineRule="auto"/>
+      <w:outlineLvl w:val="2"/>
+    </w:pPr>
+    <w:rPr>
+      <w:rFonts w:ascii="Times New Roman" w:eastAsia="Times New Roman" w:hAnsi="Times New Roman" w:cs="Times New Roman"/>
+      <w:b/>
+      <w:bCs/>
+      <w:sz w:val="27"/>
+      <w:szCs w:val="27"/>
+      <w:lang w:eastAsia="de-DE"/>
+    </w:rPr>
+  </w:style>
   <w:style w:type="character" w:default="1" w:styleId="Absatz-Standardschriftart">
     <w:name w:val="Default Paragraph Font"/>
     <w:uiPriority w:val="1"/>
@@ -775,6 +2078,120 @@
     <w:rPr>
       <w:color w:val="0000FF" w:themeColor="hyperlink"/>
       <w:u w:val="single"/>
+    </w:rPr>
+  </w:style>
+  <w:style w:type="character" w:customStyle="1" w:styleId="berschrift3Zchn">
+    <w:name w:val="Überschrift 3 Zchn"/>
+    <w:basedOn w:val="Absatz-Standardschriftart"/>
+    <w:link w:val="berschrift3"/>
+    <w:uiPriority w:val="9"/>
+    <w:rsid w:val="000361C3"/>
+    <w:rPr>
+      <w:rFonts w:ascii="Times New Roman" w:eastAsia="Times New Roman" w:hAnsi="Times New Roman" w:cs="Times New Roman"/>
+      <w:b/>
+      <w:bCs/>
+      <w:sz w:val="27"/>
+      <w:szCs w:val="27"/>
+      <w:lang w:eastAsia="de-DE"/>
+    </w:rPr>
+  </w:style>
+  <w:style w:type="paragraph" w:customStyle="1" w:styleId="mb-0">
+    <w:name w:val="!mb-0"/>
+    <w:basedOn w:val="Standard"/>
+    <w:rsid w:val="000361C3"/>
+    <w:pPr>
+      <w:spacing w:before="100" w:beforeAutospacing="1" w:after="100" w:afterAutospacing="1" w:line="240" w:lineRule="auto"/>
+    </w:pPr>
+    <w:rPr>
+      <w:rFonts w:ascii="Times New Roman" w:eastAsia="Times New Roman" w:hAnsi="Times New Roman" w:cs="Times New Roman"/>
+      <w:sz w:val="24"/>
+      <w:szCs w:val="24"/>
+      <w:lang w:eastAsia="de-DE"/>
+    </w:rPr>
+  </w:style>
+  <w:style w:type="character" w:styleId="Fett">
+    <w:name w:val="Strong"/>
+    <w:basedOn w:val="Absatz-Standardschriftart"/>
+    <w:uiPriority w:val="22"/>
+    <w:qFormat/>
+    <w:rsid w:val="000361C3"/>
+    <w:rPr>
+      <w:b/>
+      <w:bCs/>
+    </w:rPr>
+  </w:style>
+  <w:style w:type="paragraph" w:styleId="HTMLVorformatiert">
+    <w:name w:val="HTML Preformatted"/>
+    <w:basedOn w:val="Standard"/>
+    <w:link w:val="HTMLVorformatiertZchn"/>
+    <w:uiPriority w:val="99"/>
+    <w:semiHidden/>
+    <w:unhideWhenUsed/>
+    <w:rsid w:val="000361C3"/>
+    <w:pPr>
+      <w:tabs>
+        <w:tab w:val="left" w:pos="916"/>
+        <w:tab w:val="left" w:pos="1832"/>
+        <w:tab w:val="left" w:pos="2748"/>
+        <w:tab w:val="left" w:pos="3664"/>
+        <w:tab w:val="left" w:pos="4580"/>
+        <w:tab w:val="left" w:pos="5496"/>
+        <w:tab w:val="left" w:pos="6412"/>
+        <w:tab w:val="left" w:pos="7328"/>
+        <w:tab w:val="left" w:pos="8244"/>
+        <w:tab w:val="left" w:pos="9160"/>
+        <w:tab w:val="left" w:pos="10076"/>
+        <w:tab w:val="left" w:pos="10992"/>
+        <w:tab w:val="left" w:pos="11908"/>
+        <w:tab w:val="left" w:pos="12824"/>
+        <w:tab w:val="left" w:pos="13740"/>
+        <w:tab w:val="left" w:pos="14656"/>
+      </w:tabs>
+      <w:spacing w:after="0" w:line="240" w:lineRule="auto"/>
+    </w:pPr>
+    <w:rPr>
+      <w:rFonts w:ascii="Courier New" w:eastAsia="Times New Roman" w:hAnsi="Courier New" w:cs="Courier New"/>
+      <w:sz w:val="20"/>
+      <w:szCs w:val="20"/>
+      <w:lang w:eastAsia="de-DE"/>
+    </w:rPr>
+  </w:style>
+  <w:style w:type="character" w:customStyle="1" w:styleId="HTMLVorformatiertZchn">
+    <w:name w:val="HTML Vorformatiert Zchn"/>
+    <w:basedOn w:val="Absatz-Standardschriftart"/>
+    <w:link w:val="HTMLVorformatiert"/>
+    <w:uiPriority w:val="99"/>
+    <w:semiHidden/>
+    <w:rsid w:val="000361C3"/>
+    <w:rPr>
+      <w:rFonts w:ascii="Courier New" w:eastAsia="Times New Roman" w:hAnsi="Courier New" w:cs="Courier New"/>
+      <w:sz w:val="20"/>
+      <w:szCs w:val="20"/>
+      <w:lang w:eastAsia="de-DE"/>
+    </w:rPr>
+  </w:style>
+  <w:style w:type="character" w:styleId="HTMLCode">
+    <w:name w:val="HTML Code"/>
+    <w:basedOn w:val="Absatz-Standardschriftart"/>
+    <w:uiPriority w:val="99"/>
+    <w:semiHidden/>
+    <w:unhideWhenUsed/>
+    <w:rsid w:val="000361C3"/>
+    <w:rPr>
+      <w:rFonts w:ascii="Courier New" w:eastAsia="Times New Roman" w:hAnsi="Courier New" w:cs="Courier New"/>
+      <w:sz w:val="20"/>
+      <w:szCs w:val="20"/>
+    </w:rPr>
+  </w:style>
+  <w:style w:type="character" w:styleId="Hervorhebung">
+    <w:name w:val="Emphasis"/>
+    <w:basedOn w:val="Absatz-Standardschriftart"/>
+    <w:uiPriority w:val="20"/>
+    <w:qFormat/>
+    <w:rsid w:val="000361C3"/>
+    <w:rPr>
+      <w:i/>
+      <w:iCs/>
     </w:rPr>
   </w:style>
 </w:styles>
@@ -940,6 +2357,26 @@
     <w:name w:val="Normal"/>
     <w:qFormat/>
   </w:style>
+  <w:style w:type="paragraph" w:styleId="berschrift3">
+    <w:name w:val="heading 3"/>
+    <w:basedOn w:val="Standard"/>
+    <w:link w:val="berschrift3Zchn"/>
+    <w:uiPriority w:val="9"/>
+    <w:qFormat/>
+    <w:rsid w:val="000361C3"/>
+    <w:pPr>
+      <w:spacing w:before="100" w:beforeAutospacing="1" w:after="100" w:afterAutospacing="1" w:line="240" w:lineRule="auto"/>
+      <w:outlineLvl w:val="2"/>
+    </w:pPr>
+    <w:rPr>
+      <w:rFonts w:ascii="Times New Roman" w:eastAsia="Times New Roman" w:hAnsi="Times New Roman" w:cs="Times New Roman"/>
+      <w:b/>
+      <w:bCs/>
+      <w:sz w:val="27"/>
+      <w:szCs w:val="27"/>
+      <w:lang w:eastAsia="de-DE"/>
+    </w:rPr>
+  </w:style>
   <w:style w:type="character" w:default="1" w:styleId="Absatz-Standardschriftart">
     <w:name w:val="Default Paragraph Font"/>
     <w:uiPriority w:val="1"/>
@@ -1006,6 +2443,120 @@
     <w:rPr>
       <w:color w:val="0000FF" w:themeColor="hyperlink"/>
       <w:u w:val="single"/>
+    </w:rPr>
+  </w:style>
+  <w:style w:type="character" w:customStyle="1" w:styleId="berschrift3Zchn">
+    <w:name w:val="Überschrift 3 Zchn"/>
+    <w:basedOn w:val="Absatz-Standardschriftart"/>
+    <w:link w:val="berschrift3"/>
+    <w:uiPriority w:val="9"/>
+    <w:rsid w:val="000361C3"/>
+    <w:rPr>
+      <w:rFonts w:ascii="Times New Roman" w:eastAsia="Times New Roman" w:hAnsi="Times New Roman" w:cs="Times New Roman"/>
+      <w:b/>
+      <w:bCs/>
+      <w:sz w:val="27"/>
+      <w:szCs w:val="27"/>
+      <w:lang w:eastAsia="de-DE"/>
+    </w:rPr>
+  </w:style>
+  <w:style w:type="paragraph" w:customStyle="1" w:styleId="mb-0">
+    <w:name w:val="!mb-0"/>
+    <w:basedOn w:val="Standard"/>
+    <w:rsid w:val="000361C3"/>
+    <w:pPr>
+      <w:spacing w:before="100" w:beforeAutospacing="1" w:after="100" w:afterAutospacing="1" w:line="240" w:lineRule="auto"/>
+    </w:pPr>
+    <w:rPr>
+      <w:rFonts w:ascii="Times New Roman" w:eastAsia="Times New Roman" w:hAnsi="Times New Roman" w:cs="Times New Roman"/>
+      <w:sz w:val="24"/>
+      <w:szCs w:val="24"/>
+      <w:lang w:eastAsia="de-DE"/>
+    </w:rPr>
+  </w:style>
+  <w:style w:type="character" w:styleId="Fett">
+    <w:name w:val="Strong"/>
+    <w:basedOn w:val="Absatz-Standardschriftart"/>
+    <w:uiPriority w:val="22"/>
+    <w:qFormat/>
+    <w:rsid w:val="000361C3"/>
+    <w:rPr>
+      <w:b/>
+      <w:bCs/>
+    </w:rPr>
+  </w:style>
+  <w:style w:type="paragraph" w:styleId="HTMLVorformatiert">
+    <w:name w:val="HTML Preformatted"/>
+    <w:basedOn w:val="Standard"/>
+    <w:link w:val="HTMLVorformatiertZchn"/>
+    <w:uiPriority w:val="99"/>
+    <w:semiHidden/>
+    <w:unhideWhenUsed/>
+    <w:rsid w:val="000361C3"/>
+    <w:pPr>
+      <w:tabs>
+        <w:tab w:val="left" w:pos="916"/>
+        <w:tab w:val="left" w:pos="1832"/>
+        <w:tab w:val="left" w:pos="2748"/>
+        <w:tab w:val="left" w:pos="3664"/>
+        <w:tab w:val="left" w:pos="4580"/>
+        <w:tab w:val="left" w:pos="5496"/>
+        <w:tab w:val="left" w:pos="6412"/>
+        <w:tab w:val="left" w:pos="7328"/>
+        <w:tab w:val="left" w:pos="8244"/>
+        <w:tab w:val="left" w:pos="9160"/>
+        <w:tab w:val="left" w:pos="10076"/>
+        <w:tab w:val="left" w:pos="10992"/>
+        <w:tab w:val="left" w:pos="11908"/>
+        <w:tab w:val="left" w:pos="12824"/>
+        <w:tab w:val="left" w:pos="13740"/>
+        <w:tab w:val="left" w:pos="14656"/>
+      </w:tabs>
+      <w:spacing w:after="0" w:line="240" w:lineRule="auto"/>
+    </w:pPr>
+    <w:rPr>
+      <w:rFonts w:ascii="Courier New" w:eastAsia="Times New Roman" w:hAnsi="Courier New" w:cs="Courier New"/>
+      <w:sz w:val="20"/>
+      <w:szCs w:val="20"/>
+      <w:lang w:eastAsia="de-DE"/>
+    </w:rPr>
+  </w:style>
+  <w:style w:type="character" w:customStyle="1" w:styleId="HTMLVorformatiertZchn">
+    <w:name w:val="HTML Vorformatiert Zchn"/>
+    <w:basedOn w:val="Absatz-Standardschriftart"/>
+    <w:link w:val="HTMLVorformatiert"/>
+    <w:uiPriority w:val="99"/>
+    <w:semiHidden/>
+    <w:rsid w:val="000361C3"/>
+    <w:rPr>
+      <w:rFonts w:ascii="Courier New" w:eastAsia="Times New Roman" w:hAnsi="Courier New" w:cs="Courier New"/>
+      <w:sz w:val="20"/>
+      <w:szCs w:val="20"/>
+      <w:lang w:eastAsia="de-DE"/>
+    </w:rPr>
+  </w:style>
+  <w:style w:type="character" w:styleId="HTMLCode">
+    <w:name w:val="HTML Code"/>
+    <w:basedOn w:val="Absatz-Standardschriftart"/>
+    <w:uiPriority w:val="99"/>
+    <w:semiHidden/>
+    <w:unhideWhenUsed/>
+    <w:rsid w:val="000361C3"/>
+    <w:rPr>
+      <w:rFonts w:ascii="Courier New" w:eastAsia="Times New Roman" w:hAnsi="Courier New" w:cs="Courier New"/>
+      <w:sz w:val="20"/>
+      <w:szCs w:val="20"/>
+    </w:rPr>
+  </w:style>
+  <w:style w:type="character" w:styleId="Hervorhebung">
+    <w:name w:val="Emphasis"/>
+    <w:basedOn w:val="Absatz-Standardschriftart"/>
+    <w:uiPriority w:val="20"/>
+    <w:qFormat/>
+    <w:rsid w:val="000361C3"/>
+    <w:rPr>
+      <w:i/>
+      <w:iCs/>
     </w:rPr>
   </w:style>
 </w:styles>

</xml_diff>